<commit_message>
feat(export-word): bỏ mục lục (-NoToc) + gỡ trích dẫn ghi âm dạng ngoặc đơn (e15)
- Tham số -NoToc: bỏ --toc khi xuất; QC "TOC field" thành điều kiện (PASS khi không TOC nếu -NoToc)
- StripInternal e15: gỡ trích dẫn ghi âm "(sáng/chiều HH:MM–HH:MM[, ...])" dạng ngoặc đơn (e14 chỉ bắt ngoặc vuông); xử lý nhiều dải ngăn bởi phẩy; QC "no recording timestamp"=0
- Xuất lại báo cáo 18/06 (gỡ 68 dải ghi âm) + 19/06, không mục lục, QC PASS 25/25
- SKILL.md: bài học #10 (trích dẫn ngoặc đơn) + #11 (-NoToc)

Co-Authored-By: Claude Opus 4.8 (1M context) <noreply@anthropic.com>
</commit_message>
<xml_diff>
--- a/ba/sync/output/human/exports/BAO-CAO-KHAO-SAT-TOSS-18062026-v0.1-2026-06-22.docx
+++ b/ba/sync/output/human/exports/BAO-CAO-KHAO-SAT-TOSS-18062026-v0.1-2026-06-22.docx
@@ -2,32 +2,6 @@
 <file path=word/document.xml><?xml version="1.0" encoding="utf-8"?>
 <w:document xmlns:w="http://schemas.openxmlformats.org/wordprocessingml/2006/main" xmlns:m="http://schemas.openxmlformats.org/officeDocument/2006/math" xmlns:r="http://schemas.openxmlformats.org/officeDocument/2006/relationships" xmlns:o="urn:schemas-microsoft-com:office:office" xmlns:v="urn:schemas-microsoft-com:vml" xmlns:w10="urn:schemas-microsoft-com:office:word" xmlns:a="http://schemas.openxmlformats.org/drawingml/2006/main" xmlns:pic="http://schemas.openxmlformats.org/drawingml/2006/picture" xmlns:wp="http://schemas.openxmlformats.org/drawingml/2006/wordprocessingDrawing">
   <w:body>
-    <w:sdt>
-      <w:sdtPr>
-        <w:docPartObj>
-          <w:docPartGallery w:val="Table of Contents"/>
-          <w:docPartUnique/>
-        </w:docPartObj>
-      </w:sdtPr>
-      <w:sdtContent>
-        <w:p>
-          <w:pPr>
-            <w:pStyle w:val="TOCHeading"/>
-          </w:pPr>
-          <w:r>
-            <w:t xml:space="preserve">Table of Contents</w:t>
-          </w:r>
-        </w:p>
-        <w:p>
-          <w:r>
-            <w:fldChar w:fldCharType="begin" w:dirty="true"/>
-            <w:instrText xml:space="preserve">TOC \o "1-2" \h \z \u</w:instrText>
-            <w:fldChar w:fldCharType="separate"/>
-            <w:fldChar w:fldCharType="end"/>
-          </w:r>
-        </w:p>
-      </w:sdtContent>
-    </w:sdt>
     <w:bookmarkStart w:id="50" w:name="báo-cáo-khảo-sát-toss-18062026"/>
     <w:p>
       <w:pPr>
@@ -129,7 +103,7 @@
         <w:t xml:space="preserve"> </w:t>
       </w:r>
       <w:r>
-        <w:t xml:space="preserve">là nhận ra chuyến nào cần xử lý; những chuyến bình thường hoặc chưa tới giờ phải làm thì cần ẩn đi để không gây nhiễu (sáng 00:00–00:46). Đồng thời, người dùng cần được phép ẩn hoặc hiện cột, ẩn hoặc hiện dòng, và lưu lại cấu hình hiển thị riêng cho từng người (sáng 01:13–01:38).</w:t>
+        <w:t xml:space="preserve">là nhận ra chuyến nào cần xử lý; những chuyến bình thường hoặc chưa tới giờ phải làm thì cần ẩn đi để không gây nhiễu. Đồng thời, người dùng cần được phép ẩn hoặc hiện cột, ẩn hoặc hiện dòng, và lưu lại cấu hình hiển thị riêng cho từng người.</w:t>
       </w:r>
     </w:p>
     <w:p>
@@ -168,7 +142,7 @@
         <w:t xml:space="preserve"> </w:t>
       </w:r>
       <w:r>
-        <w:t xml:space="preserve">để người dùng tự chọn (sáng 00:46–01:13). Quy ước hiển thị được thống nhất gồm ba màu đỏ, vàng, xanh; với hàm ý</w:t>
+        <w:t xml:space="preserve">để người dùng tự chọn. Quy ước hiển thị được thống nhất gồm ba màu đỏ, vàng, xanh; với hàm ý</w:t>
       </w:r>
       <w:r>
         <w:t xml:space="preserve"> </w:t>
@@ -177,10 +151,7 @@
         <w:t xml:space="preserve">“đỏ là nặng nhất, vàng là chấp chới, xanh là ổn”</w:t>
       </w:r>
       <w:r>
-        <w:t xml:space="preserve"> </w:t>
-      </w:r>
-      <w:r>
-        <w:t xml:space="preserve">(sáng 26:10–26:40). Trạng thái bình thường (không có gì để cảnh báo) hiển thị bằng dấu gạch ngang hoặc để trắng (sáng 26:41–27:37). Khi di chuột (hover) lên một dòng, dòng đó được làm sáng nhẹ để nhận diện hàng đang xem; click vào dòng mới mở chi tiết và làm sáng đậm hơn (sáng 28:37–29:27). Bộ phận điều phái xác nhận không cần phát âm thanh khi có cảnh báo; trường hợp cảnh báo lớn có thể cho hiệu ứng nháy (blink) trên màn hình để gây chú ý (chiều 53:42–54:15).</w:t>
+        <w:t xml:space="preserve">. Trạng thái bình thường (không có gì để cảnh báo) hiển thị bằng dấu gạch ngang hoặc để trắng. Khi di chuột (hover) lên một dòng, dòng đó được làm sáng nhẹ để nhận diện hàng đang xem; click vào dòng mới mở chi tiết và làm sáng đậm hơn. Bộ phận điều phái xác nhận không cần phát âm thanh khi có cảnh báo; trường hợp cảnh báo lớn có thể cho hiệu ứng nháy (blink) trên màn hình để gây chú ý.</w:t>
       </w:r>
     </w:p>
     <w:p>
@@ -250,7 +221,7 @@
         <w:t xml:space="preserve"> </w:t>
       </w:r>
       <w:r>
-        <w:t xml:space="preserve">khi chuyến bay đủ điều kiện phát hành (sáng 01:38–02:06). Đây là chốt chặn cuối trước khi MO Plus cho phép phi công thực hiện Flight Release.</w:t>
+        <w:t xml:space="preserve">khi chuyến bay đủ điều kiện phát hành. Đây là chốt chặn cuối trước khi MO Plus cho phép phi công thực hiện Flight Release.</w:t>
       </w:r>
     </w:p>
     <w:p>
@@ -268,7 +239,7 @@
         <w:t xml:space="preserve"> </w:t>
       </w:r>
       <w:r>
-        <w:t xml:space="preserve">Hai bên thống nhất nút Dispatch Release chỉ sáng khi đến giờ thực hiện, đã đủ tài liệu chuyến bay, và mọi thông tin so khớp đều hiển thị xanh (sáng 02:06–02:28). Tuy nhiên không phải mọi cảnh báo đều chặn release; chỉ chọn ra một vài cảnh báo nghiêm trọng để chặn (chiều 01:14:34–01:14:58). Các điều kiện tối thiểu bắt buộc xanh trước khi cho phép release gồm tàu bay phải khớp, không còn cảnh báo về ETD vượt quá ba mươi phút (nếu ATD trên ba mươi phút phải chạy lại OFP), tổ bay phải đúng theo OFP, và Pilot Confirm đã được phi công xác nhận (chiều 01:14:58–01:15:31, chiều 01:26:24–01:26:46). Về sau, dự án sẽ bổ sung quy tắc (rule) cấu hình cảnh báo nào là cảnh báo chặn release theo thực tế vận hành (chiều 01:14:19–01:14:34).</w:t>
+        <w:t xml:space="preserve">Hai bên thống nhất nút Dispatch Release chỉ sáng khi đến giờ thực hiện, đã đủ tài liệu chuyến bay, và mọi thông tin so khớp đều hiển thị xanh. Tuy nhiên không phải mọi cảnh báo đều chặn release; chỉ chọn ra một vài cảnh báo nghiêm trọng để chặn. Các điều kiện tối thiểu bắt buộc xanh trước khi cho phép release gồm tàu bay phải khớp, không còn cảnh báo về ETD vượt quá ba mươi phút (nếu ATD trên ba mươi phút phải chạy lại OFP), tổ bay phải đúng theo OFP, và Pilot Confirm đã được phi công xác nhận. Về sau, dự án sẽ bổ sung quy tắc (rule) cấu hình cảnh báo nào là cảnh báo chặn release theo thực tế vận hành.</w:t>
       </w:r>
     </w:p>
     <w:p>
@@ -314,7 +285,7 @@
         <w:t xml:space="preserve"> </w:t>
       </w:r>
       <w:r>
-        <w:t xml:space="preserve">Bộ phận Điều phái cần một mô hình tham số cảnh báo thống nhất giữa các nhóm thông tin (OFP, Payload, DAO, Tài liệu, Tổ bay, Thời tiết) để dễ quản lý và bảo trì (sáng 42:12–42:40).</w:t>
+        <w:t xml:space="preserve">Bộ phận Điều phái cần một mô hình tham số cảnh báo thống nhất giữa các nhóm thông tin (OFP, Payload, DAO, Tài liệu, Tổ bay, Thời tiết) để dễ quản lý và bảo trì.</w:t>
       </w:r>
     </w:p>
     <w:p>
@@ -332,7 +303,7 @@
         <w:t xml:space="preserve"> </w:t>
       </w:r>
       <w:r>
-        <w:t xml:space="preserve">Mô hình hai mức cảnh báo theo thời gian được thống nhất gồm mức 1 (vàng) bắt đầu ở mốc bảy mươi lăm phút trước giờ khởi hành đối với chuyến quốc nội và mốc chín mươi phút đối với chuyến quốc tế, mức 2 (đỏ) bắt đầu ở mốc sáu mươi phút trước giờ khởi hành đối với chuyến quốc nội và mốc bảy mươi lăm phút đối với chuyến quốc tế (sáng 30:02–30:52, chiều 56:30–57:32). Trước mốc cảnh báo lần đầu (vàng), nếu có lệch thì giữ trạng thái bình thường (gạch ngang) và không hiển thị cảnh báo (sáng 31:23–31:48). Sau khi đã cảnh báo đỏ, nếu có OFP mới hoặc dữ liệu cập nhật làm cho giá trị quay về dưới ngưỡng thì trạng thái chuyển về xanh; nếu chưa có thao tác nào của điều phái và CLC tiếp tục gửi điện cập nhật làm dữ liệu khớp lại, hệ thống cũng chuyển trạng thái về xanh do bản chất điều phái chưa có</w:t>
+        <w:t xml:space="preserve">Mô hình hai mức cảnh báo theo thời gian được thống nhất gồm mức 1 (vàng) bắt đầu ở mốc bảy mươi lăm phút trước giờ khởi hành đối với chuyến quốc nội và mốc chín mươi phút đối với chuyến quốc tế, mức 2 (đỏ) bắt đầu ở mốc sáu mươi phút trước giờ khởi hành đối với chuyến quốc nội và mốc bảy mươi lăm phút đối với chuyến quốc tế. Trước mốc cảnh báo lần đầu (vàng), nếu có lệch thì giữ trạng thái bình thường (gạch ngang) và không hiển thị cảnh báo. Sau khi đã cảnh báo đỏ, nếu có OFP mới hoặc dữ liệu cập nhật làm cho giá trị quay về dưới ngưỡng thì trạng thái chuyển về xanh; nếu chưa có thao tác nào của điều phái và CLC tiếp tục gửi điện cập nhật làm dữ liệu khớp lại, hệ thống cũng chuyển trạng thái về xanh do bản chất điều phái chưa có</w:t>
       </w:r>
       <w:r>
         <w:t xml:space="preserve"> </w:t>
@@ -344,7 +315,7 @@
         <w:t xml:space="preserve"> </w:t>
       </w:r>
       <w:r>
-        <w:t xml:space="preserve">thao tác (sáng 37:31–38:10). Các mức thời gian này áp dụng chung cho nhóm cảnh báo OFP/OFP revision, Payload, DAO, Tài liệu chuyến bay, Tổ bay; với mỗi nhóm có thể tách ra cặp tham số quốc nội/quốc tế riêng (sáng 42:40–43:03).</w:t>
+        <w:t xml:space="preserve">thao tác. Các mức thời gian này áp dụng chung cho nhóm cảnh báo OFP/OFP revision, Payload, DAO, Tài liệu chuyến bay, Tổ bay; với mỗi nhóm có thể tách ra cặp tham số quốc nội/quốc tế riêng.</w:t>
       </w:r>
     </w:p>
     <w:p>
@@ -390,7 +361,7 @@
         <w:t xml:space="preserve"> </w:t>
       </w:r>
       <w:r>
-        <w:t xml:space="preserve">Khi CLC ước tính tải (estimate payload) và gửi qua điện hoặc qua email tới phân hệ điều phái, hệ thống phải so sánh với Payload trong OFP đã ban hành để cảnh báo nếu sai lệch vượt ngưỡng (sáng 11:22–12:21).</w:t>
+        <w:t xml:space="preserve">Khi CLC ước tính tải (estimate payload) và gửi qua điện hoặc qua email tới phân hệ điều phái, hệ thống phải so sánh với Payload trong OFP đã ban hành để cảnh báo nếu sai lệch vượt ngưỡng.</w:t>
       </w:r>
     </w:p>
     <w:p>
@@ -408,7 +379,7 @@
         <w:t xml:space="preserve"> </w:t>
       </w:r>
       <w:r>
-        <w:t xml:space="preserve">Ngưỡng lệch Payload được phân chia theo chặng bay và theo loại tàu bay (ví dụ A320, A321, A350, B787); mỗi cặp (chặng × tàu) có ngưỡng dương và ngưỡng âm tách biệt, cho phép dung sai tăng và giảm khác nhau (sáng 19:01–19:52). Ngưỡng có thể áp dụng theo thời gian hiệu lực (sáng 13:40–14:07). Vị trí khai báo và quản lý ngưỡng Payload nằm trong phân hệ Quản lý chặng bay dưới dạng tab</w:t>
+        <w:t xml:space="preserve">Ngưỡng lệch Payload được phân chia theo chặng bay và theo loại tàu bay (ví dụ A320, A321, A350, B787); mỗi cặp (chặng × tàu) có ngưỡng dương và ngưỡng âm tách biệt, cho phép dung sai tăng và giảm khác nhau. Ngưỡng có thể áp dụng theo thời gian hiệu lực. Vị trí khai báo và quản lý ngưỡng Payload nằm trong phân hệ Quản lý chặng bay dưới dạng tab</w:t>
       </w:r>
       <w:r>
         <w:t xml:space="preserve"> </w:t>
@@ -417,10 +388,7 @@
         <w:t xml:space="preserve">“Ngưỡng Payload”</w:t>
       </w:r>
       <w:r>
-        <w:t xml:space="preserve"> </w:t>
-      </w:r>
-      <w:r>
-        <w:t xml:space="preserve">(sáng 45:02–45:35). Khi vượt ngưỡng, hệ thống hiển thị số lệch (âm hoặc dương) tại ô tương ứng cùng với màu cảnh báo theo mốc thời gian; khi click vào dòng sẽ xem chi tiết gồm số OFP, số CLC và thời điểm cập nhật của từng bên (sáng 12:52–13:18, sáng 22:47–23:14). Hai bên cũng thống nhất cảnh báo Payload áp dụng cho cả màn tài liệu DSP (briefing).</w:t>
+        <w:t xml:space="preserve">. Khi vượt ngưỡng, hệ thống hiển thị số lệch (âm hoặc dương) tại ô tương ứng cùng với màu cảnh báo theo mốc thời gian; khi click vào dòng sẽ xem chi tiết gồm số OFP, số CLC và thời điểm cập nhật của từng bên. Hai bên cũng thống nhất cảnh báo Payload áp dụng cho cả màn tài liệu DSP (briefing).</w:t>
       </w:r>
     </w:p>
     <w:p>
@@ -466,7 +434,7 @@
         <w:t xml:space="preserve"> </w:t>
       </w:r>
       <w:r>
-        <w:t xml:space="preserve">Bộ phận Điều phái yêu cầu cảnh báo lệch DAO (Dry Operating Adjustment) giữa OFP và Actual DAO do CLC gửi, vì DAO ảnh hưởng trực tiếp đến tính toán nhiên liệu và tải khai thác (sáng 53:40–54:38).</w:t>
+        <w:t xml:space="preserve">Bộ phận Điều phái yêu cầu cảnh báo lệch DAO (Dry Operating Adjustment) giữa OFP và Actual DAO do CLC gửi, vì DAO ảnh hưởng trực tiếp đến tính toán nhiên liệu và tải khai thác.</w:t>
       </w:r>
     </w:p>
     <w:p>
@@ -493,10 +461,7 @@
         <w:t xml:space="preserve">“lệch là cảnh báo”</w:t>
       </w:r>
       <w:r>
-        <w:t xml:space="preserve"> </w:t>
-      </w:r>
-      <w:r>
-        <w:t xml:space="preserve">(sáng 51:30–52:11). Tuy nhiên, để hệ thống linh hoạt, hai bên đồng ý tạm thời vẫn cho khai báo ngưỡng DAO với giá trị mặc định bằng không, để sau này có thể tinh chỉnh theo thực tế (sáng 52:11–52:35). Nguồn DAO chuẩn được lấy từ FOEM (Flight Ops Engineering, đơn vị cấp bảng DOW), thay cho cách hiện tại đang dùng file DOW cố định qua Adapter. Hiện DAO chuẩn chỉ có trong tài liệu AFM/AM của FOE; dữ liệu DAO phụ thuộc nhiều yếu tố gồm loại tàu, chặng bay, số lượng tổ bay, số lượng tiếp viên và số lượng khách (sáng 46:11–47:21). Vị trí quản lý ngưỡng DAO nằm trong phân hệ Quản lý chặng bay dưới dạng tab</w:t>
+        <w:t xml:space="preserve">. Tuy nhiên, để hệ thống linh hoạt, hai bên đồng ý tạm thời vẫn cho khai báo ngưỡng DAO với giá trị mặc định bằng không, để sau này có thể tinh chỉnh theo thực tế. Nguồn DAO chuẩn được lấy từ FOEM (Flight Ops Engineering, đơn vị cấp bảng DOW), thay cho cách hiện tại đang dùng file DOW cố định qua Adapter. Hiện DAO chuẩn chỉ có trong tài liệu AFM/AM của FOE; dữ liệu DAO phụ thuộc nhiều yếu tố gồm loại tàu, chặng bay, số lượng tổ bay, số lượng tiếp viên và số lượng khách. Vị trí quản lý ngưỡng DAO nằm trong phân hệ Quản lý chặng bay dưới dạng tab</w:t>
       </w:r>
       <w:r>
         <w:t xml:space="preserve"> </w:t>
@@ -514,10 +479,7 @@
         <w:t xml:space="preserve">“Ngưỡng Payload”</w:t>
       </w:r>
       <w:r>
-        <w:t xml:space="preserve"> </w:t>
-      </w:r>
-      <w:r>
-        <w:t xml:space="preserve">(sáng 52:35–53:15).</w:t>
+        <w:t xml:space="preserve">.</w:t>
       </w:r>
     </w:p>
     <w:p>
@@ -572,7 +534,7 @@
         <w:t xml:space="preserve"> </w:t>
       </w:r>
       <w:r>
-        <w:t xml:space="preserve">Hệ thống cần cảnh báo khi tài liệu chuyến bay chưa được tải lên đầy đủ trước thời điểm Dispatch Release (chiều 06:01–06:48).</w:t>
+        <w:t xml:space="preserve">Hệ thống cần cảnh báo khi tài liệu chuyến bay chưa được tải lên đầy đủ trước thời điểm Dispatch Release.</w:t>
       </w:r>
     </w:p>
     <w:p>
@@ -590,7 +552,7 @@
         <w:t xml:space="preserve"> </w:t>
       </w:r>
       <w:r>
-        <w:t xml:space="preserve">Mọi chuyến bay đều phải có hai loại tài liệu cơ bản là NOTAM và thời tiết (Weather); riêng chuyến EDTO (Extended Diversion Time Operations) phải có thêm hai tài liệu là Plotting chart và Icing chart (chiều 10:49–13:18, chiều 15:22–16:01). Cơ chế nhận diện tài liệu dựa trên chuỗi ký tự trong tên file đã upload (chứa từ</w:t>
+        <w:t xml:space="preserve">Mọi chuyến bay đều phải có hai loại tài liệu cơ bản là NOTAM và thời tiết (Weather); riêng chuyến EDTO (Extended Diversion Time Operations) phải có thêm hai tài liệu là Plotting chart và Icing chart. Cơ chế nhận diện tài liệu dựa trên chuỗi ký tự trong tên file đã upload (chứa từ</w:t>
       </w:r>
       <w:r>
         <w:t xml:space="preserve"> </w:t>
@@ -611,7 +573,7 @@
         <w:t xml:space="preserve">“icing”</w:t>
       </w:r>
       <w:r>
-        <w:t xml:space="preserve">); dự án sẽ thống nhất quy ước đặt tên file qua trao đổi sau (chiều 18:12–18:53, chiều 13:18–13:49). Cảnh báo cột</w:t>
+        <w:t xml:space="preserve">); dự án sẽ thống nhất quy ước đặt tên file qua trao đổi sau. Cảnh báo cột</w:t>
       </w:r>
       <w:r>
         <w:t xml:space="preserve"> </w:t>
@@ -623,7 +585,7 @@
         <w:t xml:space="preserve"> </w:t>
       </w:r>
       <w:r>
-        <w:t xml:space="preserve">hiển thị thiếu một trong hai tài liệu (chuyến thường) hoặc một trong các tài liệu (chuyến EDTO); người dùng phải biết được cụ thể tài liệu nào đang thiếu (chiều 16:57–17:28). Mốc thời gian cảnh báo dùng chung mô hình hai mức (vàng tại mốc 75/90, đỏ tại mốc 60/75) như đã thống nhất ở chủ đề 3. Nếu thiếu tài liệu thì không cho phép Dispatch Release (chiều 17:28–18:12).</w:t>
+        <w:t xml:space="preserve">hiển thị thiếu một trong hai tài liệu (chuyến thường) hoặc một trong các tài liệu (chuyến EDTO); người dùng phải biết được cụ thể tài liệu nào đang thiếu. Mốc thời gian cảnh báo dùng chung mô hình hai mức (vàng tại mốc 75/90, đỏ tại mốc 60/75) như đã thống nhất ở chủ đề 3. Nếu thiếu tài liệu thì không cho phép Dispatch Release.</w:t>
       </w:r>
     </w:p>
     <w:p>
@@ -669,7 +631,7 @@
         <w:t xml:space="preserve"> </w:t>
       </w:r>
       <w:r>
-        <w:t xml:space="preserve">Bộ phận Điều phái cần ba lớp cảnh báo về tổ bay gồm: tổ bay đã tải tài liệu hay chưa (chỉ kiểm tra PIC), có thay đổi tổ bay (Crew Change) hay không, và OFP có rỗng tổ bay (do AVES lỗi) hay không (chiều 19:50–20:53, chiều 01:00:16–01:02:18).</w:t>
+        <w:t xml:space="preserve">Bộ phận Điều phái cần ba lớp cảnh báo về tổ bay gồm: tổ bay đã tải tài liệu hay chưa (chỉ kiểm tra PIC), có thay đổi tổ bay (Crew Change) hay không, và OFP có rỗng tổ bay (do AVES lỗi) hay không.</w:t>
       </w:r>
     </w:p>
     <w:p>
@@ -699,7 +661,7 @@
         <w:t xml:space="preserve"> </w:t>
       </w:r>
       <w:r>
-        <w:t xml:space="preserve">trên màn Monitoring (chiều 20:21–20:53). Cảnh báo Crew CHG được đặt sau cột ATC và trước cột Payload trên thứ tự cột Monitoring (chiều 01:00:16–01:00:41). Trường hợp OFP rỗng tổ bay xảy ra khi hệ thống AVES bị lỗi không trả tổ bay sang OFP; khi đó hệ thống cảnh báo đỏ tại cột tổ bay theo mốc thời gian (chiều 01:01:13–01:01:30, chiều 01:04:14–01:04:39). Thuật toán matching PIC giữa OFP và AVES sử dụng so chuỗi (string matching) theo tỷ lệ phần trăm khớp; để tăng độ chính xác, Adapter sẽ ghép group code vào sau tên crew theo cấu trúc mặc định gồm mười sáu ký tự dành cho tên cộng bốn ký tự dành cho group code, tổng cộng giới hạn hai mươi ký tự do API Lido áp đặt (chiều 01:07:55–01:09:14, chiều 01:09:14–01:09:38). Phương án thay đổi cấu trúc trường dữ liệu trong file FPX gửi ATC vẫn đang chờ ý kiến của lãnh đạo dự án (chiều 01:09:38–01:10:07).</w:t>
+        <w:t xml:space="preserve">trên màn Monitoring. Cảnh báo Crew CHG được đặt sau cột ATC và trước cột Payload trên thứ tự cột Monitoring. Trường hợp OFP rỗng tổ bay xảy ra khi hệ thống AVES bị lỗi không trả tổ bay sang OFP; khi đó hệ thống cảnh báo đỏ tại cột tổ bay theo mốc thời gian. Thuật toán matching PIC giữa OFP và AVES sử dụng so chuỗi (string matching) theo tỷ lệ phần trăm khớp; để tăng độ chính xác, Adapter sẽ ghép group code vào sau tên crew theo cấu trúc mặc định gồm mười sáu ký tự dành cho tên cộng bốn ký tự dành cho group code, tổng cộng giới hạn hai mươi ký tự do API Lido áp đặt. Phương án thay đổi cấu trúc trường dữ liệu trong file FPX gửi ATC vẫn đang chờ ý kiến của lãnh đạo dự án.</w:t>
       </w:r>
     </w:p>
     <w:p>
@@ -745,7 +707,7 @@
         <w:t xml:space="preserve"> </w:t>
       </w:r>
       <w:r>
-        <w:t xml:space="preserve">Hệ thống phải cảnh báo khi giữa AMOS, danh mục MEL đã lọc của FOE trên Lido, và MEL đang có trong OFP có sự khác biệt về số lượng và mã item (chiều 34:01–35:30).</w:t>
+        <w:t xml:space="preserve">Hệ thống phải cảnh báo khi giữa AMOS, danh mục MEL đã lọc của FOE trên Lido, và MEL đang có trong OFP có sự khác biệt về số lượng và mã item.</w:t>
       </w:r>
     </w:p>
     <w:p>
@@ -763,7 +725,7 @@
         <w:t xml:space="preserve"> </w:t>
       </w:r>
       <w:r>
-        <w:t xml:space="preserve">FOE duy trì một danh mục MEL chỉ chứa các MEL có ảnh hưởng đến khai thác (ảnh hưởng wind, fly level, fuel factor); danh mục này được upload lên Lido (chiều 34:25–34:59). Từ AMOS, dữ liệu MEL được lọc tại nguồn bằng truy vấn SQL theo trường phân loại (ảnh hưởng performance hay không) trước khi gửi sang Lido (chiều 44:13–44:48). Cảnh báo MEL/CDL hoạt động theo ba lớp: (1) lấy danh sách MEL của tàu từ AMOS cho chuyến đang xét, (2) lọc lại theo danh mục MEL trên Lido của FOE để có shortlist, (3) so sánh shortlist với danh mục MEL trong OFP do điều phái lập (chiều 47:54–48:54). Quy tắc cảnh báo: nếu OFP thiếu MEL so với shortlist thì cảnh báo đỏ; nếu OFP có dư MEL ngoài shortlist (do điều phái thêm tay) thì cũng cảnh báo, đồng thời có thể là do FOE chưa cập nhật danh mục dẫn đến thiếu — trường hợp này điều phái phản hồi để FOE bổ sung (chiều 48:54–49:39, chiều 49:39–50:07). Số lượng MEL và mã MEL phải khớp hai chiều; chỉ khớp số lượng mà sai mã cũng cảnh báo (chiều 50:07–50:38). Để xem riêng MEL theo tàu (không theo chuyến), người dùng truy cập tab</w:t>
+        <w:t xml:space="preserve">FOE duy trì một danh mục MEL chỉ chứa các MEL có ảnh hưởng đến khai thác (ảnh hưởng wind, fly level, fuel factor); danh mục này được upload lên Lido. Từ AMOS, dữ liệu MEL được lọc tại nguồn bằng truy vấn SQL theo trường phân loại (ảnh hưởng performance hay không) trước khi gửi sang Lido. Cảnh báo MEL/CDL hoạt động theo ba lớp: (1) lấy danh sách MEL của tàu từ AMOS cho chuyến đang xét, (2) lọc lại theo danh mục MEL trên Lido của FOE để có shortlist, (3) so sánh shortlist với danh mục MEL trong OFP do điều phái lập. Quy tắc cảnh báo: nếu OFP thiếu MEL so với shortlist thì cảnh báo đỏ; nếu OFP có dư MEL ngoài shortlist (do điều phái thêm tay) thì cũng cảnh báo, đồng thời có thể là do FOE chưa cập nhật danh mục dẫn đến thiếu — trường hợp này điều phái phản hồi để FOE bổ sung. Số lượng MEL và mã MEL phải khớp hai chiều; chỉ khớp số lượng mà sai mã cũng cảnh báo. Để xem riêng MEL theo tàu (không theo chuyến), người dùng truy cập tab</w:t>
       </w:r>
       <w:r>
         <w:t xml:space="preserve"> </w:t>
@@ -775,7 +737,7 @@
         <w:t xml:space="preserve"> </w:t>
       </w:r>
       <w:r>
-        <w:t xml:space="preserve">trong phân hệ Quản lý tàu bay (chiều 50:38–51:21).</w:t>
+        <w:t xml:space="preserve">trong phân hệ Quản lý tàu bay.</w:t>
       </w:r>
     </w:p>
     <w:p>
@@ -821,7 +783,7 @@
         <w:t xml:space="preserve"> </w:t>
       </w:r>
       <w:r>
-        <w:t xml:space="preserve">Cảnh báo phát hiện sai lệch giữa ATC FPL trong OFP và file ATC đã filed (Filed ATC) qua điện ATC (chiều 23:47–24:48).</w:t>
+        <w:t xml:space="preserve">Cảnh báo phát hiện sai lệch giữa ATC FPL trong OFP và file ATC đã filed (Filed ATC) qua điện ATC.</w:t>
       </w:r>
     </w:p>
     <w:p>
@@ -839,7 +801,7 @@
         <w:t xml:space="preserve"> </w:t>
       </w:r>
       <w:r>
-        <w:t xml:space="preserve">Hệ thống bóc tách ra năm thành phần cần cảnh báo trong file ATC (chiều 30:48–31:18). Cảnh báo phát sinh ngay khi có lệch (không chờ mốc thời gian như nhóm Payload/DAO) (chiều 24:50–25:18, chiều 27:16–28:01). Khi nhận điện cập nhật từ ATC, hệ thống phải xác định điện đó là cập nhật của thành phần nào trong năm thành phần; trường hợp cập nhật chỉ một phần nhỏ bên trong một thành phần (ví dụ đổi một điểm trong route, đổi mực bay) thì cần thuật toán matching chuỗi sâu hơn để vẫn nhận biết được sự thay đổi và làm nổi đúng đoạn lệch (chiều 30:17–31:47, chiều 32:10–32:41). Trường hợp đặc biệt: nếu route thêm một điểm ở giữa nhưng giữ nguyên các điểm còn lại thì có cảnh báo; nếu chỉ đổi fly level mà giữ nguyên các điểm thì không cảnh báo (chiều 01:17:37–01:18:01).</w:t>
+        <w:t xml:space="preserve">Hệ thống bóc tách ra năm thành phần cần cảnh báo trong file ATC. Cảnh báo phát sinh ngay khi có lệch (không chờ mốc thời gian như nhóm Payload/DAO). Khi nhận điện cập nhật từ ATC, hệ thống phải xác định điện đó là cập nhật của thành phần nào trong năm thành phần; trường hợp cập nhật chỉ một phần nhỏ bên trong một thành phần (ví dụ đổi một điểm trong route, đổi mực bay) thì cần thuật toán matching chuỗi sâu hơn để vẫn nhận biết được sự thay đổi và làm nổi đúng đoạn lệch. Trường hợp đặc biệt: nếu route thêm một điểm ở giữa nhưng giữ nguyên các điểm còn lại thì có cảnh báo; nếu chỉ đổi fly level mà giữ nguyên các điểm thì không cảnh báo.</w:t>
       </w:r>
     </w:p>
     <w:p>
@@ -885,7 +847,7 @@
         <w:t xml:space="preserve"> </w:t>
       </w:r>
       <w:r>
-        <w:t xml:space="preserve">Cảnh báo khi điều kiện thời tiết quan trắc thực tế (METAR/TAF) chạm hoặc vi phạm giá trị Minima của sân bay (chiều 01:19:00–01:21:01).</w:t>
+        <w:t xml:space="preserve">Cảnh báo khi điều kiện thời tiết quan trắc thực tế (METAR/TAF) chạm hoặc vi phạm giá trị Minima của sân bay.</w:t>
       </w:r>
     </w:p>
     <w:p>
@@ -903,7 +865,7 @@
         <w:t xml:space="preserve"> </w:t>
       </w:r>
       <w:r>
-        <w:t xml:space="preserve">Minima sân bay do FOE ban hành ban đầu, tuy nhiên điều phái có quyền sửa Minima cho từng tình huống cụ thể trên giao diện điều phái; FOE không trực tiếp sửa trên giao diện này (chiều 01:22:43–01:23:32). Khi METAR mới phát hành (thường vào các mốc giờ chẵn 0h00, 0h30) có chứa các hiện tượng thời tiết xấu như TSA (Thunderstorm Activity) và giá trị chạm vào margin của Minima sân bay đến của chuyến, hệ thống cảnh báo vàng và làm nháy dòng chuyến đó; nếu vi phạm Minima thì cảnh báo đỏ; cảnh báo áp dụng cả cho chuyến đang bay trên trời nhưng estimate arrival gần sân chạm Minima (chiều 01:19:28–01:20:31, chiều 01:20:31–01:21:01). Riêng nhóm Notam được hai bên thống nhất tách thành buổi làm việc riêng để phân loại chi tiết do số lượng tình huống lớn (chiều 01:23:32–01:23:58).</w:t>
+        <w:t xml:space="preserve">Minima sân bay do FOE ban hành ban đầu, tuy nhiên điều phái có quyền sửa Minima cho từng tình huống cụ thể trên giao diện điều phái; FOE không trực tiếp sửa trên giao diện này. Khi METAR mới phát hành (thường vào các mốc giờ chẵn 0h00, 0h30) có chứa các hiện tượng thời tiết xấu như TSA (Thunderstorm Activity) và giá trị chạm vào margin của Minima sân bay đến của chuyến, hệ thống cảnh báo vàng và làm nháy dòng chuyến đó; nếu vi phạm Minima thì cảnh báo đỏ; cảnh báo áp dụng cả cho chuyến đang bay trên trời nhưng estimate arrival gần sân chạm Minima. Riêng nhóm Notam được hai bên thống nhất tách thành buổi làm việc riêng để phân loại chi tiết do số lượng tình huống lớn.</w:t>
       </w:r>
     </w:p>
     <w:p>
@@ -949,7 +911,7 @@
         <w:t xml:space="preserve"> </w:t>
       </w:r>
       <w:r>
-        <w:t xml:space="preserve">Bộ phận Điều phái đã yêu cầu các cột nhiên liệu phục vụ giám sát: Pilot Confirm (PIC xác nhận release), Pilot AXA (dầu thực tế phi công đã nhập kèm lý do), và Block Fuel (sáng 23:32–24:35, chiều 06:48–07:18, chiều 01:00–02:18).</w:t>
+        <w:t xml:space="preserve">Bộ phận Điều phái đã yêu cầu các cột nhiên liệu phục vụ giám sát: Pilot Confirm (PIC xác nhận release), Pilot AXA (dầu thực tế phi công đã nhập kèm lý do), và Block Fuel.</w:t>
       </w:r>
     </w:p>
     <w:p>
@@ -967,7 +929,7 @@
         <w:t xml:space="preserve"> </w:t>
       </w:r>
       <w:r>
-        <w:t xml:space="preserve">Pilot Confirm hiển thị trạng thái phi công đã xác nhận release hay chưa; chỉ khi Pilot Confirm xanh thì mới được phép phát hành tài liệu chuyến bay (chiều 01:26:24–01:26:46). Pilot AXA hiển thị chênh lệch giữa dầu phi công tự ý lấy thêm và dầu kế hoạch, kèm lý do do phi công nhập; điều phái xem nhanh qua chế độ hover trên ô (chiều 02:18–02:51). Block Fuel hiển thị số kilogram khi cần; mặc định chỉ hiện cảnh báo khi giá trị quá ngưỡng (chiều 06:48–07:46). Khi hover lên ô của các cột nhiên liệu, hiển thị thông tin nhanh; khi click vào ô, mở chi tiết lịch sử cập nhật (chiều 01:23:46–01:25:00). Riêng cột Pilot AXA chưa thống nhất rõ phải cảnh báo gì ngoài việc cho điều phái biết phi công đã ghi lý do hay chưa (chiều 02:18–02:51).</w:t>
+        <w:t xml:space="preserve">Pilot Confirm hiển thị trạng thái phi công đã xác nhận release hay chưa; chỉ khi Pilot Confirm xanh thì mới được phép phát hành tài liệu chuyến bay. Pilot AXA hiển thị chênh lệch giữa dầu phi công tự ý lấy thêm và dầu kế hoạch, kèm lý do do phi công nhập; điều phái xem nhanh qua chế độ hover trên ô. Block Fuel hiển thị số kilogram khi cần; mặc định chỉ hiện cảnh báo khi giá trị quá ngưỡng. Khi hover lên ô của các cột nhiên liệu, hiển thị thông tin nhanh; khi click vào ô, mở chi tiết lịch sử cập nhật. Riêng cột Pilot AXA chưa thống nhất rõ phải cảnh báo gì ngoài việc cho điều phái biết phi công đã ghi lý do hay chưa.</w:t>
       </w:r>
     </w:p>
     <w:p>
@@ -1013,7 +975,7 @@
         <w:t xml:space="preserve"> </w:t>
       </w:r>
       <w:r>
-        <w:t xml:space="preserve">Phân hệ Điều phái phụ thuộc vào nhiều luồng tích hợp gồm AMOS (cấp MEL, defect, techlog), Lido (kế hoạch bay, gói tài liệu chuyến bay, OFP), FOEM (cấp DOW), AVES (cấp tổ bay), CLC (cấp điện payload, DAO actual) (sáng 06:22–07:10, sáng 23:32–24:11).</w:t>
+        <w:t xml:space="preserve">Phân hệ Điều phái phụ thuộc vào nhiều luồng tích hợp gồm AMOS (cấp MEL, defect, techlog), Lido (kế hoạch bay, gói tài liệu chuyến bay, OFP), FOEM (cấp DOW), AVES (cấp tổ bay), CLC (cấp điện payload, DAO actual).</w:t>
       </w:r>
     </w:p>
     <w:p>
@@ -1031,7 +993,7 @@
         <w:t xml:space="preserve"> </w:t>
       </w:r>
       <w:r>
-        <w:t xml:space="preserve">Luồng dữ liệu tải trọng tự động từ CLC chạy real time qua Lido Import file, đồng thời người dùng có thể nhập tay khi điện tự động không gửi được (sáng 23:51–24:35). Luồng dữ liệu DAO được kỳ vọng lấy từ FOEM khi sẵn sàng, tạm thời dùng file DOW fixed qua Adapter (sáng 07:43–08:31). Một rủi ro lớn được nêu trong buổi chiều là Adapter giữa AVES và Lido bị giới hạn hai mươi ký tự cho trường tên crew, dẫn đến phải cắt tên dài và làm sai lệch thuật toán matching PIC giữa OFP và AVES; phương án hiện nay là cắt mười sáu ký tự cho tên cộng bốn ký tự cho group code (chiều 01:07:25–01:09:38). Cơ chế ưu tiên Actual Fuel ưu tiên lấy từ ACARS trước, sau đó mới đến QAR; trường hợp các luồng tích hợp Lido/AMOS bị lỗi thì cho phép điều phái upload tài liệu thủ công làm phương án thay thế (chiều 01:27:43–01:30:23).</w:t>
+        <w:t xml:space="preserve">Luồng dữ liệu tải trọng tự động từ CLC chạy real time qua Lido Import file, đồng thời người dùng có thể nhập tay khi điện tự động không gửi được. Luồng dữ liệu DAO được kỳ vọng lấy từ FOEM khi sẵn sàng, tạm thời dùng file DOW fixed qua Adapter. Một rủi ro lớn được nêu trong buổi chiều là Adapter giữa AVES và Lido bị giới hạn hai mươi ký tự cho trường tên crew, dẫn đến phải cắt tên dài và làm sai lệch thuật toán matching PIC giữa OFP và AVES; phương án hiện nay là cắt mười sáu ký tự cho tên cộng bốn ký tự cho group code. Cơ chế ưu tiên Actual Fuel ưu tiên lấy từ ACARS trước, sau đó mới đến QAR; trường hợp các luồng tích hợp Lido/AMOS bị lỗi thì cho phép điều phái upload tài liệu thủ công làm phương án thay thế.</w:t>
       </w:r>
     </w:p>
     <w:p>
@@ -1077,7 +1039,7 @@
         <w:t xml:space="preserve"> </w:t>
       </w:r>
       <w:r>
-        <w:t xml:space="preserve">Bộ phận Điều phái mong muốn duy trì một màn hình thứ hai dạng danh sách (giống Netline hiện hữu) bên cạnh màn Monitoring để xem nhiều thông tin về OFP theo dạng bảng, lọc nhanh theo người làm OFP, lọc theo trạng thái, và xem các thông số như Block view, Taxi, CI (chiều 21:20–23:46).</w:t>
+        <w:t xml:space="preserve">Bộ phận Điều phái mong muốn duy trì một màn hình thứ hai dạng danh sách (giống Netline hiện hữu) bên cạnh màn Monitoring để xem nhiều thông tin về OFP theo dạng bảng, lọc nhanh theo người làm OFP, lọc theo trạng thái, và xem các thông số như Block view, Taxi, CI.</w:t>
       </w:r>
     </w:p>
     <w:p>
@@ -1095,7 +1057,7 @@
         <w:t xml:space="preserve"> </w:t>
       </w:r>
       <w:r>
-        <w:t xml:space="preserve">Hai bên thống nhất giữ song song hai màn: màn Monitoring là màn vận hành chính với các cột cảnh báo và mốc thời gian, màn Flight Plan dạng danh sách phục vụ tra cứu, thống kê thông tin OFP, có thể thêm các cột thông tin tùy chọn theo nhu cầu người dùng (chiều 21:59–23:17). Màn Monitoring và màn Flight Plan dùng chung dữ liệu nhưng khác về mục đích sử dụng: Monitoring tập trung vào cảnh báo, Flight Plan tập trung vào xem và thống kê (chiều 23:17–23:46).</w:t>
+        <w:t xml:space="preserve">Hai bên thống nhất giữ song song hai màn: màn Monitoring là màn vận hành chính với các cột cảnh báo và mốc thời gian, màn Flight Plan dạng danh sách phục vụ tra cứu, thống kê thông tin OFP, có thể thêm các cột thông tin tùy chọn theo nhu cầu người dùng. Màn Monitoring và màn Flight Plan dùng chung dữ liệu nhưng khác về mục đích sử dụng: Monitoring tập trung vào cảnh báo, Flight Plan tập trung vào xem và thống kê.</w:t>
       </w:r>
     </w:p>
     <w:p>

</xml_diff>

<commit_message>
export: báo cáo 18/06 & 19/06 — Times New Roman, H1 16pt / H2 13pt / body 13pt, không mục lục
Co-Authored-By: Claude Opus 4.8 (1M context) <noreply@anthropic.com>
</commit_message>
<xml_diff>
--- a/ba/sync/output/human/exports/BAO-CAO-KHAO-SAT-TOSS-18062026-v0.1-2026-06-22.docx
+++ b/ba/sync/output/human/exports/BAO-CAO-KHAO-SAT-TOSS-18062026-v0.1-2026-06-22.docx
@@ -2255,8 +2255,8 @@
     <w:rPrDefault>
       <w:rPr>
         <w:rFonts w:asciiTheme="minorHAnsi" w:cstheme="minorBidi" w:eastAsiaTheme="minorEastAsia" w:hAnsiTheme="minorHAnsi"/>
-        <w:sz w:val="24"/>
-        <w:szCs w:val="24"/>
+        <w:sz w:val="26"/>
+        <w:szCs w:val="26"/>
         <w:lang w:bidi="ar-SA" w:eastAsia="zh-CN" w:val="en-US"/>
       </w:rPr>
     </w:rPrDefault>
@@ -2446,8 +2446,8 @@
     <w:rPr>
       <w:rFonts w:ascii="Times New Roman" w:cs="Times New Roman" w:eastAsia="Times New Roman" w:hAnsi="Times New Roman"/>
       <w:color w:val="000000"/>
-      <w:sz w:val="24"/>
-      <w:szCs w:val="24"/>
+      <w:sz w:val="32"/>
+      <w:szCs w:val="32"/>
     </w:rPr>
   </w:style>
   <w:style w:styleId="Heading2" w:type="paragraph">
@@ -2470,8 +2470,8 @@
     <w:rPr>
       <w:rFonts w:ascii="Times New Roman" w:cs="Times New Roman" w:eastAsia="Times New Roman" w:hAnsi="Times New Roman"/>
       <w:color w:val="000000"/>
-      <w:sz w:val="24"/>
-      <w:szCs w:val="24"/>
+      <w:sz w:val="26"/>
+      <w:szCs w:val="26"/>
     </w:rPr>
   </w:style>
   <w:style w:styleId="Heading3" w:type="paragraph">

</xml_diff>

<commit_message>
feat(export-word): bold + căn lề cho heading; áp title 18pt center, H2 bold
- Mở rộng Set-HeadingStyle: thêm bold (chèn <w:b/><w:bCs/> vào rPr) + căn lề (w:jc trong pPr)
- Tham số mới: -H1Bold/-H1Align, -H2Bold/-H2Align
- Áp 2 báo cáo: tiêu đề (H1) 18pt căn giữa, Heading 2 13pt bold, body 13pt, Times New Roman; QC PASS 25/25
- SKILL.md §3: hướng dẫn -HxBold/-HxAlign

Co-Authored-By: Claude Opus 4.8 (1M context) <noreply@anthropic.com>
</commit_message>
<xml_diff>
--- a/ba/sync/output/human/exports/BAO-CAO-KHAO-SAT-TOSS-18062026-v0.1-2026-06-22.docx
+++ b/ba/sync/output/human/exports/BAO-CAO-KHAO-SAT-TOSS-18062026-v0.1-2026-06-22.docx
@@ -2440,14 +2440,14 @@
       <w:keepNext/>
       <w:keepLines/>
       <w:spacing w:after="240" w:before="360" w:line="240" w:lineRule="auto"/>
-      <w:jc w:val="left"/>
+      <w:jc w:val="center"/>
       <w:outlineLvl w:val="0"/>
     </w:pPr>
     <w:rPr>
       <w:rFonts w:ascii="Times New Roman" w:cs="Times New Roman" w:eastAsia="Times New Roman" w:hAnsi="Times New Roman"/>
       <w:color w:val="000000"/>
-      <w:sz w:val="32"/>
-      <w:szCs w:val="32"/>
+      <w:sz w:val="36"/>
+      <w:szCs w:val="36"/>
     </w:rPr>
   </w:style>
   <w:style w:styleId="Heading2" w:type="paragraph">
@@ -2468,6 +2468,8 @@
       <w:outlineLvl w:val="1"/>
     </w:pPr>
     <w:rPr>
+      <w:b/>
+      <w:bCs/>
       <w:rFonts w:ascii="Times New Roman" w:cs="Times New Roman" w:eastAsia="Times New Roman" w:hAnsi="Times New Roman"/>
       <w:color w:val="000000"/>
       <w:sz w:val="26"/>

</xml_diff>

<commit_message>
feat(export-word): tiêu đề dùng style "Title" thật (title block pandoc) thay vì Heading 1
- Tiêu đề render qua --metadata title → dùng đúng style "Title" sẵn có trong template (căn giữa, TNR); bỏ "# $Title" (Heading 1)
- Tự bỏ dòng "# " đầu tiên trong nguồn để tránh tiêu đề lặp (Title + Heading1)
- Tham số -TitleSize/-TitleAlign; QC mới "title style present"
- Áp 2 báo cáo: Title 18pt căn giữa, H2 13pt bold, body 13pt; QC PASS 26/26
- SKILL.md §3: ghi rõ cơ chế title block + -TitleSize/-TitleAlign

Co-Authored-By: Claude Opus 4.8 (1M context) <noreply@anthropic.com>
</commit_message>
<xml_diff>
--- a/ba/sync/output/human/exports/BAO-CAO-KHAO-SAT-TOSS-18062026-v0.1-2026-06-22.docx
+++ b/ba/sync/output/human/exports/BAO-CAO-KHAO-SAT-TOSS-18062026-v0.1-2026-06-22.docx
@@ -2,10 +2,9 @@
 <file path=word/document.xml><?xml version="1.0" encoding="utf-8"?>
 <w:document xmlns:w="http://schemas.openxmlformats.org/wordprocessingml/2006/main" xmlns:m="http://schemas.openxmlformats.org/officeDocument/2006/math" xmlns:r="http://schemas.openxmlformats.org/officeDocument/2006/relationships" xmlns:o="urn:schemas-microsoft-com:office:office" xmlns:v="urn:schemas-microsoft-com:vml" xmlns:w10="urn:schemas-microsoft-com:office:word" xmlns:a="http://schemas.openxmlformats.org/drawingml/2006/main" xmlns:pic="http://schemas.openxmlformats.org/drawingml/2006/picture" xmlns:wp="http://schemas.openxmlformats.org/drawingml/2006/wordprocessingDrawing">
   <w:body>
-    <w:bookmarkStart w:id="50" w:name="báo-cáo-khảo-sát-toss-18062026"/>
-    <w:p>
-      <w:pPr>
-        <w:pStyle w:val="Heading1"/>
+    <w:p>
+      <w:pPr>
+        <w:pStyle w:val="Title"/>
       </w:pPr>
       <w:r>
         <w:t xml:space="preserve">Báo cáo Khảo sát TOSS — 18/06/2026</w:t>
@@ -30,23 +29,40 @@
         </w:pict>
       </w:r>
     </w:p>
+    <w:bookmarkStart w:id="50" w:name="i.-thông-tin-chung"/>
+    <w:p>
+      <w:pPr>
+        <w:pStyle w:val="Heading2"/>
+      </w:pPr>
+      <w:r>
+        <w:t xml:space="preserve">I. Thông tin chung</w:t>
+      </w:r>
+    </w:p>
+    <w:p>
+      <w:pPr>
+        <w:pStyle w:val="FirstParagraph"/>
+      </w:pPr>
+      <w:r>
+        <w:t xml:space="preserve">Buổi khảo sát ngày 18/06/2026 gồm hai phiên làm việc liên tục trong cùng một ngày, kéo dài cả sáng và chiều. Đối tượng khảo sát là đại diện bộ phận Centralized Load Control (CLC) và đại diện bộ phận Điều phái bay (Dispatcher) của hãng hàng không, cùng với đội phát triển TOSS. Mục đích của buổi làm việc là làm rõ thiết kế chi tiết của màn Monitoring (giám sát chuyến bay) trong phân hệ Điều phái, bao gồm bố cục và quy ước hiển thị, cơ chế cảnh báo theo từng nhóm thông tin (tải trọng, nhiên liệu, tài liệu chuyến bay, tổ bay, MEL/CDL, ATC FPL, thời tiết), mô hình tham số cảnh báo theo mốc thời gian và điều kiện sáng nút Dispatch Release. Phạm vi thảo luận tập trung vào màn Monitoring và các tab quản lý tham số có liên quan trong phân hệ Quản lý chặng bay; không đi sâu vào các phân hệ khác trong khuôn khổ buổi 18/06.</w:t>
+      </w:r>
+    </w:p>
     <w:bookmarkEnd w:id="50"/>
-    <w:bookmarkStart w:id="68" w:name="Xe3cb70acb00b25dcc54443aee33fee16971b19f"/>
-    <w:p>
-      <w:pPr>
-        <w:pStyle w:val="Heading1"/>
-      </w:pPr>
-      <w:r>
-        <w:t xml:space="preserve">Báo cáo Khảo sát ngày 18/06/2026 — Centralized Load Control (CLC) và Điều phái bay</w:t>
-      </w:r>
-    </w:p>
-    <w:bookmarkStart w:id="51" w:name="i.-thông-tin-chung"/>
+    <w:bookmarkStart w:id="64" w:name="ii.-nội-dung-thảo-luận-theo-chủ-đề"/>
     <w:p>
       <w:pPr>
         <w:pStyle w:val="Heading2"/>
       </w:pPr>
       <w:r>
-        <w:t xml:space="preserve">I. Thông tin chung</w:t>
+        <w:t xml:space="preserve">II. Nội dung thảo luận theo chủ đề</w:t>
+      </w:r>
+    </w:p>
+    <w:bookmarkStart w:id="51" w:name="Xe0ff29f6eb55e481e5e531ac90e32b603498602"/>
+    <w:p>
+      <w:pPr>
+        <w:pStyle w:val="Heading3"/>
+      </w:pPr>
+      <w:r>
+        <w:t xml:space="preserve">1. Màn Monitoring — bố cục, quy ước hiển thị và bộ lọc mặc định (buổi sáng)</w:t>
       </w:r>
     </w:p>
     <w:p>
@@ -54,26 +70,117 @@
         <w:pStyle w:val="FirstParagraph"/>
       </w:pPr>
       <w:r>
-        <w:t xml:space="preserve">Buổi khảo sát ngày 18/06/2026 gồm hai phiên làm việc liên tục trong cùng một ngày, kéo dài cả sáng và chiều. Đối tượng khảo sát là đại diện bộ phận Centralized Load Control (CLC) và đại diện bộ phận Điều phái bay (Dispatcher) của hãng hàng không, cùng với đội phát triển TOSS. Mục đích của buổi làm việc là làm rõ thiết kế chi tiết của màn Monitoring (giám sát chuyến bay) trong phân hệ Điều phái, bao gồm bố cục và quy ước hiển thị, cơ chế cảnh báo theo từng nhóm thông tin (tải trọng, nhiên liệu, tài liệu chuyến bay, tổ bay, MEL/CDL, ATC FPL, thời tiết), mô hình tham số cảnh báo theo mốc thời gian và điều kiện sáng nút Dispatch Release. Phạm vi thảo luận tập trung vào màn Monitoring và các tab quản lý tham số có liên quan trong phân hệ Quản lý chặng bay; không đi sâu vào các phân hệ khác trong khuôn khổ buổi 18/06.</w:t>
+        <w:rPr>
+          <w:b/>
+          <w:bCs/>
+        </w:rPr>
+        <w:t xml:space="preserve">Yêu cầu.</w:t>
+      </w:r>
+      <w:r>
+        <w:t xml:space="preserve"> </w:t>
+      </w:r>
+      <w:r>
+        <w:t xml:space="preserve">Bộ phận Điều phái mong muốn màn Monitoring giúp họ</w:t>
+      </w:r>
+      <w:r>
+        <w:t xml:space="preserve"> </w:t>
+      </w:r>
+      <w:r>
+        <w:t xml:space="preserve">“lia mắt một phát”</w:t>
+      </w:r>
+      <w:r>
+        <w:t xml:space="preserve"> </w:t>
+      </w:r>
+      <w:r>
+        <w:t xml:space="preserve">là nhận ra chuyến nào cần xử lý; những chuyến bình thường hoặc chưa tới giờ phải làm thì cần ẩn đi để không gây nhiễu. Đồng thời, người dùng cần được phép ẩn hoặc hiện cột, ẩn hoặc hiện dòng, và lưu lại cấu hình hiển thị riêng cho từng người.</w:t>
+      </w:r>
+    </w:p>
+    <w:p>
+      <w:pPr>
+        <w:pStyle w:val="BodyText"/>
+      </w:pPr>
+      <w:r>
+        <w:rPr>
+          <w:b/>
+          <w:bCs/>
+        </w:rPr>
+        <w:t xml:space="preserve">Thảo luận và Đề xuất.</w:t>
+      </w:r>
+      <w:r>
+        <w:t xml:space="preserve"> </w:t>
+      </w:r>
+      <w:r>
+        <w:t xml:space="preserve">Hai bên thống nhất bộ lọc mặc định khi mở màn là chỉ hiển thị các chuyến bất thường, đồng thời vẫn cung cấp các bộ lọc khác như</w:t>
+      </w:r>
+      <w:r>
+        <w:t xml:space="preserve"> </w:t>
+      </w:r>
+      <w:r>
+        <w:t xml:space="preserve">“normal và bất thường”</w:t>
+      </w:r>
+      <w:r>
+        <w:t xml:space="preserve">,</w:t>
+      </w:r>
+      <w:r>
+        <w:t xml:space="preserve"> </w:t>
+      </w:r>
+      <w:r>
+        <w:t xml:space="preserve">“tất cả”</w:t>
+      </w:r>
+      <w:r>
+        <w:t xml:space="preserve"> </w:t>
+      </w:r>
+      <w:r>
+        <w:t xml:space="preserve">để người dùng tự chọn. Quy ước hiển thị được thống nhất gồm ba màu đỏ, vàng, xanh; với hàm ý</w:t>
+      </w:r>
+      <w:r>
+        <w:t xml:space="preserve"> </w:t>
+      </w:r>
+      <w:r>
+        <w:t xml:space="preserve">“đỏ là nặng nhất, vàng là chấp chới, xanh là ổn”</w:t>
+      </w:r>
+      <w:r>
+        <w:t xml:space="preserve">. Trạng thái bình thường (không có gì để cảnh báo) hiển thị bằng dấu gạch ngang hoặc để trắng. Khi di chuột (hover) lên một dòng, dòng đó được làm sáng nhẹ để nhận diện hàng đang xem; click vào dòng mới mở chi tiết và làm sáng đậm hơn. Bộ phận điều phái xác nhận không cần phát âm thanh khi có cảnh báo; trường hợp cảnh báo lớn có thể cho hiệu ứng nháy (blink) trên màn hình để gây chú ý.</w:t>
+      </w:r>
+    </w:p>
+    <w:p>
+      <w:pPr>
+        <w:pStyle w:val="BodyText"/>
+      </w:pPr>
+      <w:r>
+        <w:rPr>
+          <w:b/>
+          <w:bCs/>
+        </w:rPr>
+        <w:t xml:space="preserve">Kết luận.</w:t>
+      </w:r>
+      <w:r>
+        <w:t xml:space="preserve"> </w:t>
+      </w:r>
+      <w:r>
+        <w:t xml:space="preserve">Màn Monitoring vận hành với bộ lọc mặc định chỉ hiện chuyến bất thường, hỗ trợ ẩn/hiện cột và dòng, lưu cấu hình theo người dùng; quy ước màu cảnh báo và quy ước</w:t>
+      </w:r>
+      <w:r>
+        <w:t xml:space="preserve"> </w:t>
+      </w:r>
+      <w:r>
+        <w:t xml:space="preserve">“bình thường = gạch ngang/blank”</w:t>
+      </w:r>
+      <w:r>
+        <w:t xml:space="preserve"> </w:t>
+      </w:r>
+      <w:r>
+        <w:t xml:space="preserve">được áp dụng đồng nhất trên toàn bộ các cột cảnh báo của màn.</w:t>
       </w:r>
     </w:p>
     <w:bookmarkEnd w:id="51"/>
-    <w:bookmarkStart w:id="65" w:name="ii.-nội-dung-thảo-luận-theo-chủ-đề"/>
-    <w:p>
-      <w:pPr>
-        <w:pStyle w:val="Heading2"/>
-      </w:pPr>
-      <w:r>
-        <w:t xml:space="preserve">II. Nội dung thảo luận theo chủ đề</w:t>
-      </w:r>
-    </w:p>
-    <w:bookmarkStart w:id="52" w:name="Xe0ff29f6eb55e481e5e531ac90e32b603498602"/>
+    <w:bookmarkStart w:id="52" w:name="Xe389d1f508f09666a9ce7bd635e75ba64578004"/>
     <w:p>
       <w:pPr>
         <w:pStyle w:val="Heading3"/>
       </w:pPr>
       <w:r>
-        <w:t xml:space="preserve">1. Màn Monitoring — bố cục, quy ước hiển thị và bộ lọc mặc định (buổi sáng)</w:t>
+        <w:t xml:space="preserve">2. Nút Dispatch Release — điều kiện sáng nút và phạm vi cảnh báo chặn (buổi sáng + chiều)</w:t>
       </w:r>
     </w:p>
     <w:p>
@@ -91,19 +198,19 @@
         <w:t xml:space="preserve"> </w:t>
       </w:r>
       <w:r>
-        <w:t xml:space="preserve">Bộ phận Điều phái mong muốn màn Monitoring giúp họ</w:t>
-      </w:r>
-      <w:r>
-        <w:t xml:space="preserve"> </w:t>
-      </w:r>
-      <w:r>
-        <w:t xml:space="preserve">“lia mắt một phát”</w:t>
-      </w:r>
-      <w:r>
-        <w:t xml:space="preserve"> </w:t>
-      </w:r>
-      <w:r>
-        <w:t xml:space="preserve">là nhận ra chuyến nào cần xử lý; những chuyến bình thường hoặc chưa tới giờ phải làm thì cần ẩn đi để không gây nhiễu. Đồng thời, người dùng cần được phép ẩn hoặc hiện cột, ẩn hoặc hiện dòng, và lưu lại cấu hình hiển thị riêng cho từng người.</w:t>
+        <w:t xml:space="preserve">Nút Dispatch Release cần được kiểm soát chặt chẽ để chỉ</w:t>
+      </w:r>
+      <w:r>
+        <w:t xml:space="preserve"> </w:t>
+      </w:r>
+      <w:r>
+        <w:t xml:space="preserve">“sáng lên”</w:t>
+      </w:r>
+      <w:r>
+        <w:t xml:space="preserve"> </w:t>
+      </w:r>
+      <w:r>
+        <w:t xml:space="preserve">khi chuyến bay đủ điều kiện phát hành. Đây là chốt chặn cuối trước khi MO Plus cho phép phi công thực hiện Flight Release.</w:t>
       </w:r>
     </w:p>
     <w:p>
@@ -121,37 +228,7 @@
         <w:t xml:space="preserve"> </w:t>
       </w:r>
       <w:r>
-        <w:t xml:space="preserve">Hai bên thống nhất bộ lọc mặc định khi mở màn là chỉ hiển thị các chuyến bất thường, đồng thời vẫn cung cấp các bộ lọc khác như</w:t>
-      </w:r>
-      <w:r>
-        <w:t xml:space="preserve"> </w:t>
-      </w:r>
-      <w:r>
-        <w:t xml:space="preserve">“normal và bất thường”</w:t>
-      </w:r>
-      <w:r>
-        <w:t xml:space="preserve">,</w:t>
-      </w:r>
-      <w:r>
-        <w:t xml:space="preserve"> </w:t>
-      </w:r>
-      <w:r>
-        <w:t xml:space="preserve">“tất cả”</w:t>
-      </w:r>
-      <w:r>
-        <w:t xml:space="preserve"> </w:t>
-      </w:r>
-      <w:r>
-        <w:t xml:space="preserve">để người dùng tự chọn. Quy ước hiển thị được thống nhất gồm ba màu đỏ, vàng, xanh; với hàm ý</w:t>
-      </w:r>
-      <w:r>
-        <w:t xml:space="preserve"> </w:t>
-      </w:r>
-      <w:r>
-        <w:t xml:space="preserve">“đỏ là nặng nhất, vàng là chấp chới, xanh là ổn”</w:t>
-      </w:r>
-      <w:r>
-        <w:t xml:space="preserve">. Trạng thái bình thường (không có gì để cảnh báo) hiển thị bằng dấu gạch ngang hoặc để trắng. Khi di chuột (hover) lên một dòng, dòng đó được làm sáng nhẹ để nhận diện hàng đang xem; click vào dòng mới mở chi tiết và làm sáng đậm hơn. Bộ phận điều phái xác nhận không cần phát âm thanh khi có cảnh báo; trường hợp cảnh báo lớn có thể cho hiệu ứng nháy (blink) trên màn hình để gây chú ý.</w:t>
+        <w:t xml:space="preserve">Hai bên thống nhất nút Dispatch Release chỉ sáng khi đến giờ thực hiện, đã đủ tài liệu chuyến bay, và mọi thông tin so khớp đều hiển thị xanh. Tuy nhiên không phải mọi cảnh báo đều chặn release; chỉ chọn ra một vài cảnh báo nghiêm trọng để chặn. Các điều kiện tối thiểu bắt buộc xanh trước khi cho phép release gồm tàu bay phải khớp, không còn cảnh báo về ETD vượt quá ba mươi phút (nếu ATD trên ba mươi phút phải chạy lại OFP), tổ bay phải đúng theo OFP, và Pilot Confirm đã được phi công xác nhận. Về sau, dự án sẽ bổ sung quy tắc (rule) cấu hình cảnh báo nào là cảnh báo chặn release theo thực tế vận hành.</w:t>
       </w:r>
     </w:p>
     <w:p>
@@ -169,29 +246,17 @@
         <w:t xml:space="preserve"> </w:t>
       </w:r>
       <w:r>
-        <w:t xml:space="preserve">Màn Monitoring vận hành với bộ lọc mặc định chỉ hiện chuyến bất thường, hỗ trợ ẩn/hiện cột và dòng, lưu cấu hình theo người dùng; quy ước màu cảnh báo và quy ước</w:t>
-      </w:r>
-      <w:r>
-        <w:t xml:space="preserve"> </w:t>
-      </w:r>
-      <w:r>
-        <w:t xml:space="preserve">“bình thường = gạch ngang/blank”</w:t>
-      </w:r>
-      <w:r>
-        <w:t xml:space="preserve"> </w:t>
-      </w:r>
-      <w:r>
-        <w:t xml:space="preserve">được áp dụng đồng nhất trên toàn bộ các cột cảnh báo của màn.</w:t>
+        <w:t xml:space="preserve">Cơ chế bật/tắt nút Dispatch Release dựa trên kiểm tra đa điều kiện (đến giờ, đủ tài liệu, các trường thông tin so khớp xanh) và chỉ một tập con các cảnh báo nghiêm trọng được dùng làm điều kiện chặn; tập con này sẽ được tinh chỉnh sau khi đưa vào khai thác thực tế.</w:t>
       </w:r>
     </w:p>
     <w:bookmarkEnd w:id="52"/>
-    <w:bookmarkStart w:id="53" w:name="Xe389d1f508f09666a9ce7bd635e75ba64578004"/>
+    <w:bookmarkStart w:id="53" w:name="X0ad467618662dc10408e251832eb23857e6ad4e"/>
     <w:p>
       <w:pPr>
         <w:pStyle w:val="Heading3"/>
       </w:pPr>
       <w:r>
-        <w:t xml:space="preserve">2. Nút Dispatch Release — điều kiện sáng nút và phạm vi cảnh báo chặn (buổi sáng + chiều)</w:t>
+        <w:t xml:space="preserve">3. Mô hình tham số cảnh báo theo hai mức thời gian và phân biệt nội địa/quốc tế (buổi sáng)</w:t>
       </w:r>
     </w:p>
     <w:p>
@@ -209,19 +274,7 @@
         <w:t xml:space="preserve"> </w:t>
       </w:r>
       <w:r>
-        <w:t xml:space="preserve">Nút Dispatch Release cần được kiểm soát chặt chẽ để chỉ</w:t>
-      </w:r>
-      <w:r>
-        <w:t xml:space="preserve"> </w:t>
-      </w:r>
-      <w:r>
-        <w:t xml:space="preserve">“sáng lên”</w:t>
-      </w:r>
-      <w:r>
-        <w:t xml:space="preserve"> </w:t>
-      </w:r>
-      <w:r>
-        <w:t xml:space="preserve">khi chuyến bay đủ điều kiện phát hành. Đây là chốt chặn cuối trước khi MO Plus cho phép phi công thực hiện Flight Release.</w:t>
+        <w:t xml:space="preserve">Bộ phận Điều phái cần một mô hình tham số cảnh báo thống nhất giữa các nhóm thông tin (OFP, Payload, DAO, Tài liệu, Tổ bay, Thời tiết) để dễ quản lý và bảo trì.</w:t>
       </w:r>
     </w:p>
     <w:p>
@@ -239,7 +292,19 @@
         <w:t xml:space="preserve"> </w:t>
       </w:r>
       <w:r>
-        <w:t xml:space="preserve">Hai bên thống nhất nút Dispatch Release chỉ sáng khi đến giờ thực hiện, đã đủ tài liệu chuyến bay, và mọi thông tin so khớp đều hiển thị xanh. Tuy nhiên không phải mọi cảnh báo đều chặn release; chỉ chọn ra một vài cảnh báo nghiêm trọng để chặn. Các điều kiện tối thiểu bắt buộc xanh trước khi cho phép release gồm tàu bay phải khớp, không còn cảnh báo về ETD vượt quá ba mươi phút (nếu ATD trên ba mươi phút phải chạy lại OFP), tổ bay phải đúng theo OFP, và Pilot Confirm đã được phi công xác nhận. Về sau, dự án sẽ bổ sung quy tắc (rule) cấu hình cảnh báo nào là cảnh báo chặn release theo thực tế vận hành.</w:t>
+        <w:t xml:space="preserve">Mô hình hai mức cảnh báo theo thời gian được thống nhất gồm mức 1 (vàng) bắt đầu ở mốc bảy mươi lăm phút trước giờ khởi hành đối với chuyến quốc nội và mốc chín mươi phút đối với chuyến quốc tế, mức 2 (đỏ) bắt đầu ở mốc sáu mươi phút trước giờ khởi hành đối với chuyến quốc nội và mốc bảy mươi lăm phút đối với chuyến quốc tế. Trước mốc cảnh báo lần đầu (vàng), nếu có lệch thì giữ trạng thái bình thường (gạch ngang) và không hiển thị cảnh báo. Sau khi đã cảnh báo đỏ, nếu có OFP mới hoặc dữ liệu cập nhật làm cho giá trị quay về dưới ngưỡng thì trạng thái chuyển về xanh; nếu chưa có thao tác nào của điều phái và CLC tiếp tục gửi điện cập nhật làm dữ liệu khớp lại, hệ thống cũng chuyển trạng thái về xanh do bản chất điều phái chưa có</w:t>
+      </w:r>
+      <w:r>
+        <w:t xml:space="preserve"> </w:t>
+      </w:r>
+      <w:r>
+        <w:t xml:space="preserve">“lưu vết”</w:t>
+      </w:r>
+      <w:r>
+        <w:t xml:space="preserve"> </w:t>
+      </w:r>
+      <w:r>
+        <w:t xml:space="preserve">thao tác. Các mức thời gian này áp dụng chung cho nhóm cảnh báo OFP/OFP revision, Payload, DAO, Tài liệu chuyến bay, Tổ bay; với mỗi nhóm có thể tách ra cặp tham số quốc nội/quốc tế riêng.</w:t>
       </w:r>
     </w:p>
     <w:p>
@@ -257,17 +322,17 @@
         <w:t xml:space="preserve"> </w:t>
       </w:r>
       <w:r>
-        <w:t xml:space="preserve">Cơ chế bật/tắt nút Dispatch Release dựa trên kiểm tra đa điều kiện (đến giờ, đủ tài liệu, các trường thông tin so khớp xanh) và chỉ một tập con các cảnh báo nghiêm trọng được dùng làm điều kiện chặn; tập con này sẽ được tinh chỉnh sau khi đưa vào khai thác thực tế.</w:t>
+        <w:t xml:space="preserve">Mô hình tham số cảnh báo gồm hai mức thời gian (vàng và đỏ), mỗi mức có cặp tham số quốc nội/quốc tế (75/90 cho mức vàng, 60/75 cho mức đỏ); tham số được quản lý linh hoạt cho phép người dùng cập nhật khi có thay đổi.</w:t>
       </w:r>
     </w:p>
     <w:bookmarkEnd w:id="53"/>
-    <w:bookmarkStart w:id="54" w:name="X0ad467618662dc10408e251832eb23857e6ad4e"/>
+    <w:bookmarkStart w:id="54" w:name="Xcbaf5e4982525e6c84b14d2c7048d989962555b"/>
     <w:p>
       <w:pPr>
         <w:pStyle w:val="Heading3"/>
       </w:pPr>
       <w:r>
-        <w:t xml:space="preserve">3. Mô hình tham số cảnh báo theo hai mức thời gian và phân biệt nội địa/quốc tế (buổi sáng)</w:t>
+        <w:t xml:space="preserve">4. Cảnh báo tải trọng (Payload và ZFW) — có ngưỡng theo chặng × tàu (buổi sáng)</w:t>
       </w:r>
     </w:p>
     <w:p>
@@ -285,7 +350,7 @@
         <w:t xml:space="preserve"> </w:t>
       </w:r>
       <w:r>
-        <w:t xml:space="preserve">Bộ phận Điều phái cần một mô hình tham số cảnh báo thống nhất giữa các nhóm thông tin (OFP, Payload, DAO, Tài liệu, Tổ bay, Thời tiết) để dễ quản lý và bảo trì.</w:t>
+        <w:t xml:space="preserve">Khi CLC ước tính tải (estimate payload) và gửi qua điện hoặc qua email tới phân hệ điều phái, hệ thống phải so sánh với Payload trong OFP đã ban hành để cảnh báo nếu sai lệch vượt ngưỡng.</w:t>
       </w:r>
     </w:p>
     <w:p>
@@ -303,19 +368,16 @@
         <w:t xml:space="preserve"> </w:t>
       </w:r>
       <w:r>
-        <w:t xml:space="preserve">Mô hình hai mức cảnh báo theo thời gian được thống nhất gồm mức 1 (vàng) bắt đầu ở mốc bảy mươi lăm phút trước giờ khởi hành đối với chuyến quốc nội và mốc chín mươi phút đối với chuyến quốc tế, mức 2 (đỏ) bắt đầu ở mốc sáu mươi phút trước giờ khởi hành đối với chuyến quốc nội và mốc bảy mươi lăm phút đối với chuyến quốc tế. Trước mốc cảnh báo lần đầu (vàng), nếu có lệch thì giữ trạng thái bình thường (gạch ngang) và không hiển thị cảnh báo. Sau khi đã cảnh báo đỏ, nếu có OFP mới hoặc dữ liệu cập nhật làm cho giá trị quay về dưới ngưỡng thì trạng thái chuyển về xanh; nếu chưa có thao tác nào của điều phái và CLC tiếp tục gửi điện cập nhật làm dữ liệu khớp lại, hệ thống cũng chuyển trạng thái về xanh do bản chất điều phái chưa có</w:t>
-      </w:r>
-      <w:r>
-        <w:t xml:space="preserve"> </w:t>
-      </w:r>
-      <w:r>
-        <w:t xml:space="preserve">“lưu vết”</w:t>
-      </w:r>
-      <w:r>
-        <w:t xml:space="preserve"> </w:t>
-      </w:r>
-      <w:r>
-        <w:t xml:space="preserve">thao tác. Các mức thời gian này áp dụng chung cho nhóm cảnh báo OFP/OFP revision, Payload, DAO, Tài liệu chuyến bay, Tổ bay; với mỗi nhóm có thể tách ra cặp tham số quốc nội/quốc tế riêng.</w:t>
+        <w:t xml:space="preserve">Ngưỡng lệch Payload được phân chia theo chặng bay và theo loại tàu bay (ví dụ A320, A321, A350, B787); mỗi cặp (chặng × tàu) có ngưỡng dương và ngưỡng âm tách biệt, cho phép dung sai tăng và giảm khác nhau. Ngưỡng có thể áp dụng theo thời gian hiệu lực. Vị trí khai báo và quản lý ngưỡng Payload nằm trong phân hệ Quản lý chặng bay dưới dạng tab</w:t>
+      </w:r>
+      <w:r>
+        <w:t xml:space="preserve"> </w:t>
+      </w:r>
+      <w:r>
+        <w:t xml:space="preserve">“Ngưỡng Payload”</w:t>
+      </w:r>
+      <w:r>
+        <w:t xml:space="preserve">. Khi vượt ngưỡng, hệ thống hiển thị số lệch (âm hoặc dương) tại ô tương ứng cùng với màu cảnh báo theo mốc thời gian; khi click vào dòng sẽ xem chi tiết gồm số OFP, số CLC và thời điểm cập nhật của từng bên. Hai bên cũng thống nhất cảnh báo Payload áp dụng cho cả màn tài liệu DSP (briefing).</w:t>
       </w:r>
     </w:p>
     <w:p>
@@ -333,17 +395,17 @@
         <w:t xml:space="preserve"> </w:t>
       </w:r>
       <w:r>
-        <w:t xml:space="preserve">Mô hình tham số cảnh báo gồm hai mức thời gian (vàng và đỏ), mỗi mức có cặp tham số quốc nội/quốc tế (75/90 cho mức vàng, 60/75 cho mức đỏ); tham số được quản lý linh hoạt cho phép người dùng cập nhật khi có thay đổi.</w:t>
+        <w:t xml:space="preserve">Cảnh báo Payload hoạt động trên cơ chế ngưỡng theo chặng × loại tàu × ngưỡng âm/dương × thời điểm hiệu lực; hiển thị số lệch tại ô cảnh báo và màu theo mốc thời gian (xem chủ đề 3).</w:t>
       </w:r>
     </w:p>
     <w:bookmarkEnd w:id="54"/>
-    <w:bookmarkStart w:id="55" w:name="Xcbaf5e4982525e6c84b14d2c7048d989962555b"/>
+    <w:bookmarkStart w:id="55" w:name="Xd4427b4b87aaef8adee50b531ed1438f6f77392"/>
     <w:p>
       <w:pPr>
         <w:pStyle w:val="Heading3"/>
       </w:pPr>
       <w:r>
-        <w:t xml:space="preserve">4. Cảnh báo tải trọng (Payload và ZFW) — có ngưỡng theo chặng × tàu (buổi sáng)</w:t>
+        <w:t xml:space="preserve">5. Cảnh báo DAO/DOW — không có ngưỡng, lệch là cảnh báo, nguồn từ FOEM (buổi sáng)</w:t>
       </w:r>
     </w:p>
     <w:p>
@@ -361,7 +423,7 @@
         <w:t xml:space="preserve"> </w:t>
       </w:r>
       <w:r>
-        <w:t xml:space="preserve">Khi CLC ước tính tải (estimate payload) và gửi qua điện hoặc qua email tới phân hệ điều phái, hệ thống phải so sánh với Payload trong OFP đã ban hành để cảnh báo nếu sai lệch vượt ngưỡng.</w:t>
+        <w:t xml:space="preserve">Bộ phận Điều phái yêu cầu cảnh báo lệch DAO (Dry Operating Adjustment) giữa OFP và Actual DAO do CLC gửi, vì DAO ảnh hưởng trực tiếp đến tính toán nhiên liệu và tải khai thác.</w:t>
       </w:r>
     </w:p>
     <w:p>
@@ -379,7 +441,25 @@
         <w:t xml:space="preserve"> </w:t>
       </w:r>
       <w:r>
-        <w:t xml:space="preserve">Ngưỡng lệch Payload được phân chia theo chặng bay và theo loại tàu bay (ví dụ A320, A321, A350, B787); mỗi cặp (chặng × tàu) có ngưỡng dương và ngưỡng âm tách biệt, cho phép dung sai tăng và giảm khác nhau. Ngưỡng có thể áp dụng theo thời gian hiệu lực. Vị trí khai báo và quản lý ngưỡng Payload nằm trong phân hệ Quản lý chặng bay dưới dạng tab</w:t>
+        <w:t xml:space="preserve">Khác với Payload, DAO không có ngưỡng dung sai; nguyên tắc là</w:t>
+      </w:r>
+      <w:r>
+        <w:t xml:space="preserve"> </w:t>
+      </w:r>
+      <w:r>
+        <w:t xml:space="preserve">“lệch là cảnh báo”</w:t>
+      </w:r>
+      <w:r>
+        <w:t xml:space="preserve">. Tuy nhiên, để hệ thống linh hoạt, hai bên đồng ý tạm thời vẫn cho khai báo ngưỡng DAO với giá trị mặc định bằng không, để sau này có thể tinh chỉnh theo thực tế. Nguồn DAO chuẩn được lấy từ FOEM (Flight Ops Engineering, đơn vị cấp bảng DOW), thay cho cách hiện tại đang dùng file DOW cố định qua Adapter. Hiện DAO chuẩn chỉ có trong tài liệu AFM/AM của FOE; dữ liệu DAO phụ thuộc nhiều yếu tố gồm loại tàu, chặng bay, số lượng tổ bay, số lượng tiếp viên và số lượng khách. Vị trí quản lý ngưỡng DAO nằm trong phân hệ Quản lý chặng bay dưới dạng tab</w:t>
+      </w:r>
+      <w:r>
+        <w:t xml:space="preserve"> </w:t>
+      </w:r>
+      <w:r>
+        <w:t xml:space="preserve">“Ngưỡng DAO”</w:t>
+      </w:r>
+      <w:r>
+        <w:t xml:space="preserve">, song song với tab</w:t>
       </w:r>
       <w:r>
         <w:t xml:space="preserve"> </w:t>
@@ -388,7 +468,7 @@
         <w:t xml:space="preserve">“Ngưỡng Payload”</w:t>
       </w:r>
       <w:r>
-        <w:t xml:space="preserve">. Khi vượt ngưỡng, hệ thống hiển thị số lệch (âm hoặc dương) tại ô tương ứng cùng với màu cảnh báo theo mốc thời gian; khi click vào dòng sẽ xem chi tiết gồm số OFP, số CLC và thời điểm cập nhật của từng bên. Hai bên cũng thống nhất cảnh báo Payload áp dụng cho cả màn tài liệu DSP (briefing).</w:t>
+        <w:t xml:space="preserve">.</w:t>
       </w:r>
     </w:p>
     <w:p>
@@ -406,17 +486,26 @@
         <w:t xml:space="preserve"> </w:t>
       </w:r>
       <w:r>
-        <w:t xml:space="preserve">Cảnh báo Payload hoạt động trên cơ chế ngưỡng theo chặng × loại tàu × ngưỡng âm/dương × thời điểm hiệu lực; hiển thị số lệch tại ô cảnh báo và màu theo mốc thời gian (xem chủ đề 3).</w:t>
+        <w:t xml:space="preserve">Cảnh báo DAO áp dụng quy tắc</w:t>
+      </w:r>
+      <w:r>
+        <w:t xml:space="preserve"> </w:t>
+      </w:r>
+      <w:r>
+        <w:t xml:space="preserve">“lệch là cảnh báo”</w:t>
+      </w:r>
+      <w:r>
+        <w:t xml:space="preserve">, có khả năng khai báo ngưỡng linh hoạt với mặc định bằng không; nguồn DAO chuẩn lấy từ FOEM, có cơ chế fallback dùng file DOW cố định khi FOEM chưa sẵn sàng.</w:t>
       </w:r>
     </w:p>
     <w:bookmarkEnd w:id="55"/>
-    <w:bookmarkStart w:id="56" w:name="Xd4427b4b87aaef8adee50b531ed1438f6f77392"/>
+    <w:bookmarkStart w:id="56" w:name="Xb218403a4373a7ebbcb439c9eda8b2fbea33018"/>
     <w:p>
       <w:pPr>
         <w:pStyle w:val="Heading3"/>
       </w:pPr>
       <w:r>
-        <w:t xml:space="preserve">5. Cảnh báo DAO/DOW — không có ngưỡng, lệch là cảnh báo, nguồn từ FOEM (buổi sáng)</w:t>
+        <w:t xml:space="preserve">6. Cảnh báo tài liệu chuyến bay (Fly Doc) — NOTAM, thời tiết, Plotting và Icing chart (buổi chiều)</w:t>
       </w:r>
     </w:p>
     <w:p>
@@ -434,7 +523,7 @@
         <w:t xml:space="preserve"> </w:t>
       </w:r>
       <w:r>
-        <w:t xml:space="preserve">Bộ phận Điều phái yêu cầu cảnh báo lệch DAO (Dry Operating Adjustment) giữa OFP và Actual DAO do CLC gửi, vì DAO ảnh hưởng trực tiếp đến tính toán nhiên liệu và tải khai thác.</w:t>
+        <w:t xml:space="preserve">Hệ thống cần cảnh báo khi tài liệu chuyến bay chưa được tải lên đầy đủ trước thời điểm Dispatch Release.</w:t>
       </w:r>
     </w:p>
     <w:p>
@@ -452,34 +541,40 @@
         <w:t xml:space="preserve"> </w:t>
       </w:r>
       <w:r>
-        <w:t xml:space="preserve">Khác với Payload, DAO không có ngưỡng dung sai; nguyên tắc là</w:t>
-      </w:r>
-      <w:r>
-        <w:t xml:space="preserve"> </w:t>
-      </w:r>
-      <w:r>
-        <w:t xml:space="preserve">“lệch là cảnh báo”</w:t>
-      </w:r>
-      <w:r>
-        <w:t xml:space="preserve">. Tuy nhiên, để hệ thống linh hoạt, hai bên đồng ý tạm thời vẫn cho khai báo ngưỡng DAO với giá trị mặc định bằng không, để sau này có thể tinh chỉnh theo thực tế. Nguồn DAO chuẩn được lấy từ FOEM (Flight Ops Engineering, đơn vị cấp bảng DOW), thay cho cách hiện tại đang dùng file DOW cố định qua Adapter. Hiện DAO chuẩn chỉ có trong tài liệu AFM/AM của FOE; dữ liệu DAO phụ thuộc nhiều yếu tố gồm loại tàu, chặng bay, số lượng tổ bay, số lượng tiếp viên và số lượng khách. Vị trí quản lý ngưỡng DAO nằm trong phân hệ Quản lý chặng bay dưới dạng tab</w:t>
-      </w:r>
-      <w:r>
-        <w:t xml:space="preserve"> </w:t>
-      </w:r>
-      <w:r>
-        <w:t xml:space="preserve">“Ngưỡng DAO”</w:t>
-      </w:r>
-      <w:r>
-        <w:t xml:space="preserve">, song song với tab</w:t>
-      </w:r>
-      <w:r>
-        <w:t xml:space="preserve"> </w:t>
-      </w:r>
-      <w:r>
-        <w:t xml:space="preserve">“Ngưỡng Payload”</w:t>
-      </w:r>
-      <w:r>
-        <w:t xml:space="preserve">.</w:t>
+        <w:t xml:space="preserve">Mọi chuyến bay đều phải có hai loại tài liệu cơ bản là NOTAM và thời tiết (Weather); riêng chuyến EDTO (Extended Diversion Time Operations) phải có thêm hai tài liệu là Plotting chart và Icing chart. Cơ chế nhận diện tài liệu dựa trên chuỗi ký tự trong tên file đã upload (chứa từ</w:t>
+      </w:r>
+      <w:r>
+        <w:t xml:space="preserve"> </w:t>
+      </w:r>
+      <w:r>
+        <w:t xml:space="preserve">“plotting”</w:t>
+      </w:r>
+      <w:r>
+        <w:t xml:space="preserve"> </w:t>
+      </w:r>
+      <w:r>
+        <w:t xml:space="preserve">và</w:t>
+      </w:r>
+      <w:r>
+        <w:t xml:space="preserve"> </w:t>
+      </w:r>
+      <w:r>
+        <w:t xml:space="preserve">“icing”</w:t>
+      </w:r>
+      <w:r>
+        <w:t xml:space="preserve">); dự án sẽ thống nhất quy ước đặt tên file qua trao đổi sau. Cảnh báo cột</w:t>
+      </w:r>
+      <w:r>
+        <w:t xml:space="preserve"> </w:t>
+      </w:r>
+      <w:r>
+        <w:t xml:space="preserve">“Fly Doc”</w:t>
+      </w:r>
+      <w:r>
+        <w:t xml:space="preserve"> </w:t>
+      </w:r>
+      <w:r>
+        <w:t xml:space="preserve">hiển thị thiếu một trong hai tài liệu (chuyến thường) hoặc một trong các tài liệu (chuyến EDTO); người dùng phải biết được cụ thể tài liệu nào đang thiếu. Mốc thời gian cảnh báo dùng chung mô hình hai mức (vàng tại mốc 75/90, đỏ tại mốc 60/75) như đã thống nhất ở chủ đề 3. Nếu thiếu tài liệu thì không cho phép Dispatch Release.</w:t>
       </w:r>
     </w:p>
     <w:p>
@@ -497,26 +592,17 @@
         <w:t xml:space="preserve"> </w:t>
       </w:r>
       <w:r>
-        <w:t xml:space="preserve">Cảnh báo DAO áp dụng quy tắc</w:t>
-      </w:r>
-      <w:r>
-        <w:t xml:space="preserve"> </w:t>
-      </w:r>
-      <w:r>
-        <w:t xml:space="preserve">“lệch là cảnh báo”</w:t>
-      </w:r>
-      <w:r>
-        <w:t xml:space="preserve">, có khả năng khai báo ngưỡng linh hoạt với mặc định bằng không; nguồn DAO chuẩn lấy từ FOEM, có cơ chế fallback dùng file DOW cố định khi FOEM chưa sẵn sàng.</w:t>
+        <w:t xml:space="preserve">Cảnh báo Fly Doc kiểm tra sự hiện diện của NOTAM và Weather cho mọi chuyến, kiểm tra thêm Plotting và Icing cho chuyến EDTO; thiếu tài liệu sẽ chặn Dispatch Release.</w:t>
       </w:r>
     </w:p>
     <w:bookmarkEnd w:id="56"/>
-    <w:bookmarkStart w:id="57" w:name="Xb218403a4373a7ebbcb439c9eda8b2fbea33018"/>
+    <w:bookmarkStart w:id="57" w:name="X67c4a673a9c1b20a77a5f87c3e76b08c3f7e1ad"/>
     <w:p>
       <w:pPr>
         <w:pStyle w:val="Heading3"/>
       </w:pPr>
       <w:r>
-        <w:t xml:space="preserve">6. Cảnh báo tài liệu chuyến bay (Fly Doc) — NOTAM, thời tiết, Plotting và Icing chart (buổi chiều)</w:t>
+        <w:t xml:space="preserve">7. Cảnh báo tổ bay — Crew Download, đổi tổ (Crew CHG), OFP rỗng tổ bay, matching PIC (buổi chiều)</w:t>
       </w:r>
     </w:p>
     <w:p>
@@ -534,7 +620,7 @@
         <w:t xml:space="preserve"> </w:t>
       </w:r>
       <w:r>
-        <w:t xml:space="preserve">Hệ thống cần cảnh báo khi tài liệu chuyến bay chưa được tải lên đầy đủ trước thời điểm Dispatch Release.</w:t>
+        <w:t xml:space="preserve">Bộ phận Điều phái cần ba lớp cảnh báo về tổ bay gồm: tổ bay đã tải tài liệu hay chưa (chỉ kiểm tra PIC), có thay đổi tổ bay (Crew Change) hay không, và OFP có rỗng tổ bay (do AVES lỗi) hay không.</w:t>
       </w:r>
     </w:p>
     <w:p>
@@ -552,40 +638,19 @@
         <w:t xml:space="preserve"> </w:t>
       </w:r>
       <w:r>
-        <w:t xml:space="preserve">Mọi chuyến bay đều phải có hai loại tài liệu cơ bản là NOTAM và thời tiết (Weather); riêng chuyến EDTO (Extended Diversion Time Operations) phải có thêm hai tài liệu là Plotting chart và Icing chart. Cơ chế nhận diện tài liệu dựa trên chuỗi ký tự trong tên file đã upload (chứa từ</w:t>
-      </w:r>
-      <w:r>
-        <w:t xml:space="preserve"> </w:t>
-      </w:r>
-      <w:r>
-        <w:t xml:space="preserve">“plotting”</w:t>
-      </w:r>
-      <w:r>
-        <w:t xml:space="preserve"> </w:t>
-      </w:r>
-      <w:r>
-        <w:t xml:space="preserve">và</w:t>
-      </w:r>
-      <w:r>
-        <w:t xml:space="preserve"> </w:t>
-      </w:r>
-      <w:r>
-        <w:t xml:space="preserve">“icing”</w:t>
-      </w:r>
-      <w:r>
-        <w:t xml:space="preserve">); dự án sẽ thống nhất quy ước đặt tên file qua trao đổi sau. Cảnh báo cột</w:t>
-      </w:r>
-      <w:r>
-        <w:t xml:space="preserve"> </w:t>
-      </w:r>
-      <w:r>
-        <w:t xml:space="preserve">“Fly Doc”</w:t>
-      </w:r>
-      <w:r>
-        <w:t xml:space="preserve"> </w:t>
-      </w:r>
-      <w:r>
-        <w:t xml:space="preserve">hiển thị thiếu một trong hai tài liệu (chuyến thường) hoặc một trong các tài liệu (chuyến EDTO); người dùng phải biết được cụ thể tài liệu nào đang thiếu. Mốc thời gian cảnh báo dùng chung mô hình hai mức (vàng tại mốc 75/90, đỏ tại mốc 60/75) như đã thống nhất ở chủ đề 3. Nếu thiếu tài liệu thì không cho phép Dispatch Release.</w:t>
+        <w:t xml:space="preserve">Cảnh báo Crew Download chỉ áp dụng cho PIC, vì chỉ cần PIC tải tài liệu là đủ điều kiện cho phép Flight Release; cảnh báo này hiển thị qua cột</w:t>
+      </w:r>
+      <w:r>
+        <w:t xml:space="preserve"> </w:t>
+      </w:r>
+      <w:r>
+        <w:t xml:space="preserve">“Crew Download”</w:t>
+      </w:r>
+      <w:r>
+        <w:t xml:space="preserve"> </w:t>
+      </w:r>
+      <w:r>
+        <w:t xml:space="preserve">trên màn Monitoring. Cảnh báo Crew CHG được đặt sau cột ATC và trước cột Payload trên thứ tự cột Monitoring. Trường hợp OFP rỗng tổ bay xảy ra khi hệ thống AVES bị lỗi không trả tổ bay sang OFP; khi đó hệ thống cảnh báo đỏ tại cột tổ bay theo mốc thời gian. Thuật toán matching PIC giữa OFP và AVES sử dụng so chuỗi (string matching) theo tỷ lệ phần trăm khớp; để tăng độ chính xác, Adapter sẽ ghép group code vào sau tên crew theo cấu trúc mặc định gồm mười sáu ký tự dành cho tên cộng bốn ký tự dành cho group code, tổng cộng giới hạn hai mươi ký tự do API Lido áp đặt. Phương án thay đổi cấu trúc trường dữ liệu trong file FPX gửi ATC vẫn đang chờ ý kiến của lãnh đạo dự án.</w:t>
       </w:r>
     </w:p>
     <w:p>
@@ -603,17 +668,17 @@
         <w:t xml:space="preserve"> </w:t>
       </w:r>
       <w:r>
-        <w:t xml:space="preserve">Cảnh báo Fly Doc kiểm tra sự hiện diện của NOTAM và Weather cho mọi chuyến, kiểm tra thêm Plotting và Icing cho chuyến EDTO; thiếu tài liệu sẽ chặn Dispatch Release.</w:t>
+        <w:t xml:space="preserve">Cảnh báo tổ bay gồm ba thành phần — Crew Download (chỉ PIC), Crew CHG (đổi tổ), OFP rỗng tổ bay — và thuật toán matching PIC dựa trên so chuỗi cộng group code; phương án nới giới hạn hai mươi ký tự của Adapter Lido cần được lãnh đạo dự án xem xét.</w:t>
       </w:r>
     </w:p>
     <w:bookmarkEnd w:id="57"/>
-    <w:bookmarkStart w:id="58" w:name="X67c4a673a9c1b20a77a5f87c3e76b08c3f7e1ad"/>
+    <w:bookmarkStart w:id="58" w:name="Xff690494c6e34e43ff8561c2adf98f03299a898"/>
     <w:p>
       <w:pPr>
         <w:pStyle w:val="Heading3"/>
       </w:pPr>
       <w:r>
-        <w:t xml:space="preserve">7. Cảnh báo tổ bay — Crew Download, đổi tổ (Crew CHG), OFP rỗng tổ bay, matching PIC (buổi chiều)</w:t>
+        <w:t xml:space="preserve">8. Cảnh báo MEL/CDL — đối chiếu ba lớp AMOS, danh mục FOE và OFP (buổi chiều)</w:t>
       </w:r>
     </w:p>
     <w:p>
@@ -631,7 +696,7 @@
         <w:t xml:space="preserve"> </w:t>
       </w:r>
       <w:r>
-        <w:t xml:space="preserve">Bộ phận Điều phái cần ba lớp cảnh báo về tổ bay gồm: tổ bay đã tải tài liệu hay chưa (chỉ kiểm tra PIC), có thay đổi tổ bay (Crew Change) hay không, và OFP có rỗng tổ bay (do AVES lỗi) hay không.</w:t>
+        <w:t xml:space="preserve">Hệ thống phải cảnh báo khi giữa AMOS, danh mục MEL đã lọc của FOE trên Lido, và MEL đang có trong OFP có sự khác biệt về số lượng và mã item.</w:t>
       </w:r>
     </w:p>
     <w:p>
@@ -649,19 +714,19 @@
         <w:t xml:space="preserve"> </w:t>
       </w:r>
       <w:r>
-        <w:t xml:space="preserve">Cảnh báo Crew Download chỉ áp dụng cho PIC, vì chỉ cần PIC tải tài liệu là đủ điều kiện cho phép Flight Release; cảnh báo này hiển thị qua cột</w:t>
-      </w:r>
-      <w:r>
-        <w:t xml:space="preserve"> </w:t>
-      </w:r>
-      <w:r>
-        <w:t xml:space="preserve">“Crew Download”</w:t>
-      </w:r>
-      <w:r>
-        <w:t xml:space="preserve"> </w:t>
-      </w:r>
-      <w:r>
-        <w:t xml:space="preserve">trên màn Monitoring. Cảnh báo Crew CHG được đặt sau cột ATC và trước cột Payload trên thứ tự cột Monitoring. Trường hợp OFP rỗng tổ bay xảy ra khi hệ thống AVES bị lỗi không trả tổ bay sang OFP; khi đó hệ thống cảnh báo đỏ tại cột tổ bay theo mốc thời gian. Thuật toán matching PIC giữa OFP và AVES sử dụng so chuỗi (string matching) theo tỷ lệ phần trăm khớp; để tăng độ chính xác, Adapter sẽ ghép group code vào sau tên crew theo cấu trúc mặc định gồm mười sáu ký tự dành cho tên cộng bốn ký tự dành cho group code, tổng cộng giới hạn hai mươi ký tự do API Lido áp đặt. Phương án thay đổi cấu trúc trường dữ liệu trong file FPX gửi ATC vẫn đang chờ ý kiến của lãnh đạo dự án.</w:t>
+        <w:t xml:space="preserve">FOE duy trì một danh mục MEL chỉ chứa các MEL có ảnh hưởng đến khai thác (ảnh hưởng wind, fly level, fuel factor); danh mục này được upload lên Lido. Từ AMOS, dữ liệu MEL được lọc tại nguồn bằng truy vấn SQL theo trường phân loại (ảnh hưởng performance hay không) trước khi gửi sang Lido. Cảnh báo MEL/CDL hoạt động theo ba lớp: (1) lấy danh sách MEL của tàu từ AMOS cho chuyến đang xét, (2) lọc lại theo danh mục MEL trên Lido của FOE để có shortlist, (3) so sánh shortlist với danh mục MEL trong OFP do điều phái lập. Quy tắc cảnh báo: nếu OFP thiếu MEL so với shortlist thì cảnh báo đỏ; nếu OFP có dư MEL ngoài shortlist (do điều phái thêm tay) thì cũng cảnh báo, đồng thời có thể là do FOE chưa cập nhật danh mục dẫn đến thiếu — trường hợp này điều phái phản hồi để FOE bổ sung. Số lượng MEL và mã MEL phải khớp hai chiều; chỉ khớp số lượng mà sai mã cũng cảnh báo. Để xem riêng MEL theo tàu (không theo chuyến), người dùng truy cập tab</w:t>
+      </w:r>
+      <w:r>
+        <w:t xml:space="preserve"> </w:t>
+      </w:r>
+      <w:r>
+        <w:t xml:space="preserve">“MEL/CDL”</w:t>
+      </w:r>
+      <w:r>
+        <w:t xml:space="preserve"> </w:t>
+      </w:r>
+      <w:r>
+        <w:t xml:space="preserve">trong phân hệ Quản lý tàu bay.</w:t>
       </w:r>
     </w:p>
     <w:p>
@@ -679,17 +744,17 @@
         <w:t xml:space="preserve"> </w:t>
       </w:r>
       <w:r>
-        <w:t xml:space="preserve">Cảnh báo tổ bay gồm ba thành phần — Crew Download (chỉ PIC), Crew CHG (đổi tổ), OFP rỗng tổ bay — và thuật toán matching PIC dựa trên so chuỗi cộng group code; phương án nới giới hạn hai mươi ký tự của Adapter Lido cần được lãnh đạo dự án xem xét.</w:t>
+        <w:t xml:space="preserve">Cảnh báo MEL/CDL chạy quy trình ba lớp AMOS rồi shortlist FOE trên Lido rồi OFP; cảnh báo thiếu, thừa, sai mã đều được kích hoạt; tra cứu MEL theo tàu bay nằm ở phân hệ Quản lý tàu bay.</w:t>
       </w:r>
     </w:p>
     <w:bookmarkEnd w:id="58"/>
-    <w:bookmarkStart w:id="59" w:name="Xff690494c6e34e43ff8561c2adf98f03299a898"/>
+    <w:bookmarkStart w:id="59" w:name="Xd3149b8ace623a3ad54948d15577b621a14d1f1"/>
     <w:p>
       <w:pPr>
         <w:pStyle w:val="Heading3"/>
       </w:pPr>
       <w:r>
-        <w:t xml:space="preserve">8. Cảnh báo MEL/CDL — đối chiếu ba lớp AMOS, danh mục FOE và OFP (buổi chiều)</w:t>
+        <w:t xml:space="preserve">9. Cảnh báo ATC FPL — so khớp Filed ATC và ATC FPL trong OFP, xử lý cập nhật một phần (buổi chiều)</w:t>
       </w:r>
     </w:p>
     <w:p>
@@ -707,7 +772,7 @@
         <w:t xml:space="preserve"> </w:t>
       </w:r>
       <w:r>
-        <w:t xml:space="preserve">Hệ thống phải cảnh báo khi giữa AMOS, danh mục MEL đã lọc của FOE trên Lido, và MEL đang có trong OFP có sự khác biệt về số lượng và mã item.</w:t>
+        <w:t xml:space="preserve">Cảnh báo phát hiện sai lệch giữa ATC FPL trong OFP và file ATC đã filed (Filed ATC) qua điện ATC.</w:t>
       </w:r>
     </w:p>
     <w:p>
@@ -725,19 +790,7 @@
         <w:t xml:space="preserve"> </w:t>
       </w:r>
       <w:r>
-        <w:t xml:space="preserve">FOE duy trì một danh mục MEL chỉ chứa các MEL có ảnh hưởng đến khai thác (ảnh hưởng wind, fly level, fuel factor); danh mục này được upload lên Lido. Từ AMOS, dữ liệu MEL được lọc tại nguồn bằng truy vấn SQL theo trường phân loại (ảnh hưởng performance hay không) trước khi gửi sang Lido. Cảnh báo MEL/CDL hoạt động theo ba lớp: (1) lấy danh sách MEL của tàu từ AMOS cho chuyến đang xét, (2) lọc lại theo danh mục MEL trên Lido của FOE để có shortlist, (3) so sánh shortlist với danh mục MEL trong OFP do điều phái lập. Quy tắc cảnh báo: nếu OFP thiếu MEL so với shortlist thì cảnh báo đỏ; nếu OFP có dư MEL ngoài shortlist (do điều phái thêm tay) thì cũng cảnh báo, đồng thời có thể là do FOE chưa cập nhật danh mục dẫn đến thiếu — trường hợp này điều phái phản hồi để FOE bổ sung. Số lượng MEL và mã MEL phải khớp hai chiều; chỉ khớp số lượng mà sai mã cũng cảnh báo. Để xem riêng MEL theo tàu (không theo chuyến), người dùng truy cập tab</w:t>
-      </w:r>
-      <w:r>
-        <w:t xml:space="preserve"> </w:t>
-      </w:r>
-      <w:r>
-        <w:t xml:space="preserve">“MEL/CDL”</w:t>
-      </w:r>
-      <w:r>
-        <w:t xml:space="preserve"> </w:t>
-      </w:r>
-      <w:r>
-        <w:t xml:space="preserve">trong phân hệ Quản lý tàu bay.</w:t>
+        <w:t xml:space="preserve">Hệ thống bóc tách ra năm thành phần cần cảnh báo trong file ATC. Cảnh báo phát sinh ngay khi có lệch (không chờ mốc thời gian như nhóm Payload/DAO). Khi nhận điện cập nhật từ ATC, hệ thống phải xác định điện đó là cập nhật của thành phần nào trong năm thành phần; trường hợp cập nhật chỉ một phần nhỏ bên trong một thành phần (ví dụ đổi một điểm trong route, đổi mực bay) thì cần thuật toán matching chuỗi sâu hơn để vẫn nhận biết được sự thay đổi và làm nổi đúng đoạn lệch. Trường hợp đặc biệt: nếu route thêm một điểm ở giữa nhưng giữ nguyên các điểm còn lại thì có cảnh báo; nếu chỉ đổi fly level mà giữ nguyên các điểm thì không cảnh báo.</w:t>
       </w:r>
     </w:p>
     <w:p>
@@ -755,17 +808,17 @@
         <w:t xml:space="preserve"> </w:t>
       </w:r>
       <w:r>
-        <w:t xml:space="preserve">Cảnh báo MEL/CDL chạy quy trình ba lớp AMOS rồi shortlist FOE trên Lido rồi OFP; cảnh báo thiếu, thừa, sai mã đều được kích hoạt; tra cứu MEL theo tàu bay nằm ở phân hệ Quản lý tàu bay.</w:t>
+        <w:t xml:space="preserve">Cảnh báo ATC FPL phát sinh ngay khi có lệch, không phụ thuộc mốc thời gian; cần xây dựng thuật toán matching và làm nổi chính xác từng thành phần thay đổi; quy tắc xử lý cập nhật một phần (đổi điểm, đổi mực bay) đã được phân loại sơ bộ.</w:t>
       </w:r>
     </w:p>
     <w:bookmarkEnd w:id="59"/>
-    <w:bookmarkStart w:id="60" w:name="Xd3149b8ace623a3ad54948d15577b621a14d1f1"/>
+    <w:bookmarkStart w:id="60" w:name="Xee61b83285e65d01a65c14b45d0ed367e2a9a1d"/>
     <w:p>
       <w:pPr>
         <w:pStyle w:val="Heading3"/>
       </w:pPr>
       <w:r>
-        <w:t xml:space="preserve">9. Cảnh báo ATC FPL — so khớp Filed ATC và ATC FPL trong OFP, xử lý cập nhật một phần (buổi chiều)</w:t>
+        <w:t xml:space="preserve">10. Cảnh báo thời tiết theo Minima sân bay (buổi chiều)</w:t>
       </w:r>
     </w:p>
     <w:p>
@@ -783,7 +836,7 @@
         <w:t xml:space="preserve"> </w:t>
       </w:r>
       <w:r>
-        <w:t xml:space="preserve">Cảnh báo phát hiện sai lệch giữa ATC FPL trong OFP và file ATC đã filed (Filed ATC) qua điện ATC.</w:t>
+        <w:t xml:space="preserve">Cảnh báo khi điều kiện thời tiết quan trắc thực tế (METAR/TAF) chạm hoặc vi phạm giá trị Minima của sân bay.</w:t>
       </w:r>
     </w:p>
     <w:p>
@@ -801,7 +854,7 @@
         <w:t xml:space="preserve"> </w:t>
       </w:r>
       <w:r>
-        <w:t xml:space="preserve">Hệ thống bóc tách ra năm thành phần cần cảnh báo trong file ATC. Cảnh báo phát sinh ngay khi có lệch (không chờ mốc thời gian như nhóm Payload/DAO). Khi nhận điện cập nhật từ ATC, hệ thống phải xác định điện đó là cập nhật của thành phần nào trong năm thành phần; trường hợp cập nhật chỉ một phần nhỏ bên trong một thành phần (ví dụ đổi một điểm trong route, đổi mực bay) thì cần thuật toán matching chuỗi sâu hơn để vẫn nhận biết được sự thay đổi và làm nổi đúng đoạn lệch. Trường hợp đặc biệt: nếu route thêm một điểm ở giữa nhưng giữ nguyên các điểm còn lại thì có cảnh báo; nếu chỉ đổi fly level mà giữ nguyên các điểm thì không cảnh báo.</w:t>
+        <w:t xml:space="preserve">Minima sân bay do FOE ban hành ban đầu, tuy nhiên điều phái có quyền sửa Minima cho từng tình huống cụ thể trên giao diện điều phái; FOE không trực tiếp sửa trên giao diện này. Khi METAR mới phát hành (thường vào các mốc giờ chẵn 0h00, 0h30) có chứa các hiện tượng thời tiết xấu như TSA (Thunderstorm Activity) và giá trị chạm vào margin của Minima sân bay đến của chuyến, hệ thống cảnh báo vàng và làm nháy dòng chuyến đó; nếu vi phạm Minima thì cảnh báo đỏ; cảnh báo áp dụng cả cho chuyến đang bay trên trời nhưng estimate arrival gần sân chạm Minima. Riêng nhóm Notam được hai bên thống nhất tách thành buổi làm việc riêng để phân loại chi tiết do số lượng tình huống lớn.</w:t>
       </w:r>
     </w:p>
     <w:p>
@@ -819,17 +872,17 @@
         <w:t xml:space="preserve"> </w:t>
       </w:r>
       <w:r>
-        <w:t xml:space="preserve">Cảnh báo ATC FPL phát sinh ngay khi có lệch, không phụ thuộc mốc thời gian; cần xây dựng thuật toán matching và làm nổi chính xác từng thành phần thay đổi; quy tắc xử lý cập nhật một phần (đổi điểm, đổi mực bay) đã được phân loại sơ bộ.</w:t>
+        <w:t xml:space="preserve">Cảnh báo thời tiết theo Minima sân bay gồm hai mức (vàng khi chạm margin, đỏ khi vi phạm); Minima do FOE ban hành và điều phái được phép sửa; tích hợp luồng METAR/TAF tự động; chủ đề Notam tách buổi riêng.</w:t>
       </w:r>
     </w:p>
     <w:bookmarkEnd w:id="60"/>
-    <w:bookmarkStart w:id="61" w:name="Xee61b83285e65d01a65c14b45d0ed367e2a9a1d"/>
+    <w:bookmarkStart w:id="61" w:name="X2e5e443deed23846852d62c322361f7261ca8d6"/>
     <w:p>
       <w:pPr>
         <w:pStyle w:val="Heading3"/>
       </w:pPr>
       <w:r>
-        <w:t xml:space="preserve">10. Cảnh báo thời tiết theo Minima sân bay (buổi chiều)</w:t>
+        <w:t xml:space="preserve">11. Cột nhiên liệu — Pilot Confirm, Pilot AXA, Block Fuel (buổi chiều)</w:t>
       </w:r>
     </w:p>
     <w:p>
@@ -847,7 +900,7 @@
         <w:t xml:space="preserve"> </w:t>
       </w:r>
       <w:r>
-        <w:t xml:space="preserve">Cảnh báo khi điều kiện thời tiết quan trắc thực tế (METAR/TAF) chạm hoặc vi phạm giá trị Minima của sân bay.</w:t>
+        <w:t xml:space="preserve">Bộ phận Điều phái đã yêu cầu các cột nhiên liệu phục vụ giám sát: Pilot Confirm (PIC xác nhận release), Pilot AXA (dầu thực tế phi công đã nhập kèm lý do), và Block Fuel.</w:t>
       </w:r>
     </w:p>
     <w:p>
@@ -865,7 +918,7 @@
         <w:t xml:space="preserve"> </w:t>
       </w:r>
       <w:r>
-        <w:t xml:space="preserve">Minima sân bay do FOE ban hành ban đầu, tuy nhiên điều phái có quyền sửa Minima cho từng tình huống cụ thể trên giao diện điều phái; FOE không trực tiếp sửa trên giao diện này. Khi METAR mới phát hành (thường vào các mốc giờ chẵn 0h00, 0h30) có chứa các hiện tượng thời tiết xấu như TSA (Thunderstorm Activity) và giá trị chạm vào margin của Minima sân bay đến của chuyến, hệ thống cảnh báo vàng và làm nháy dòng chuyến đó; nếu vi phạm Minima thì cảnh báo đỏ; cảnh báo áp dụng cả cho chuyến đang bay trên trời nhưng estimate arrival gần sân chạm Minima. Riêng nhóm Notam được hai bên thống nhất tách thành buổi làm việc riêng để phân loại chi tiết do số lượng tình huống lớn.</w:t>
+        <w:t xml:space="preserve">Pilot Confirm hiển thị trạng thái phi công đã xác nhận release hay chưa; chỉ khi Pilot Confirm xanh thì mới được phép phát hành tài liệu chuyến bay. Pilot AXA hiển thị chênh lệch giữa dầu phi công tự ý lấy thêm và dầu kế hoạch, kèm lý do do phi công nhập; điều phái xem nhanh qua chế độ hover trên ô. Block Fuel hiển thị số kilogram khi cần; mặc định chỉ hiện cảnh báo khi giá trị quá ngưỡng. Khi hover lên ô của các cột nhiên liệu, hiển thị thông tin nhanh; khi click vào ô, mở chi tiết lịch sử cập nhật. Riêng cột Pilot AXA chưa thống nhất rõ phải cảnh báo gì ngoài việc cho điều phái biết phi công đã ghi lý do hay chưa.</w:t>
       </w:r>
     </w:p>
     <w:p>
@@ -883,17 +936,17 @@
         <w:t xml:space="preserve"> </w:t>
       </w:r>
       <w:r>
-        <w:t xml:space="preserve">Cảnh báo thời tiết theo Minima sân bay gồm hai mức (vàng khi chạm margin, đỏ khi vi phạm); Minima do FOE ban hành và điều phái được phép sửa; tích hợp luồng METAR/TAF tự động; chủ đề Notam tách buổi riêng.</w:t>
+        <w:t xml:space="preserve">Ba cột nhiên liệu được hiển thị theo nguyên tắc tối giản: chỉ hiện số khi vượt ngưỡng hoặc khi có chênh lệch; tương tác hover xem nhanh và click xem chi tiết; quy tắc cảnh báo cụ thể của Pilot AXA cần làm rõ thêm.</w:t>
       </w:r>
     </w:p>
     <w:bookmarkEnd w:id="61"/>
-    <w:bookmarkStart w:id="62" w:name="X2e5e443deed23846852d62c322361f7261ca8d6"/>
+    <w:bookmarkStart w:id="62" w:name="X6a347a20ea226c0bca9b775a817af44dce32f4d"/>
     <w:p>
       <w:pPr>
         <w:pStyle w:val="Heading3"/>
       </w:pPr>
       <w:r>
-        <w:t xml:space="preserve">11. Cột nhiên liệu — Pilot Confirm, Pilot AXA, Block Fuel (buổi chiều)</w:t>
+        <w:t xml:space="preserve">12. Tích hợp và rủi ro Adapter — AMOS, Lido Import file, ưu tiên Actual Fuel ACARS (buổi sáng + chiều)</w:t>
       </w:r>
     </w:p>
     <w:p>
@@ -911,7 +964,7 @@
         <w:t xml:space="preserve"> </w:t>
       </w:r>
       <w:r>
-        <w:t xml:space="preserve">Bộ phận Điều phái đã yêu cầu các cột nhiên liệu phục vụ giám sát: Pilot Confirm (PIC xác nhận release), Pilot AXA (dầu thực tế phi công đã nhập kèm lý do), và Block Fuel.</w:t>
+        <w:t xml:space="preserve">Phân hệ Điều phái phụ thuộc vào nhiều luồng tích hợp gồm AMOS (cấp MEL, defect, techlog), Lido (kế hoạch bay, gói tài liệu chuyến bay, OFP), FOEM (cấp DOW), AVES (cấp tổ bay), CLC (cấp điện payload, DAO actual).</w:t>
       </w:r>
     </w:p>
     <w:p>
@@ -929,7 +982,7 @@
         <w:t xml:space="preserve"> </w:t>
       </w:r>
       <w:r>
-        <w:t xml:space="preserve">Pilot Confirm hiển thị trạng thái phi công đã xác nhận release hay chưa; chỉ khi Pilot Confirm xanh thì mới được phép phát hành tài liệu chuyến bay. Pilot AXA hiển thị chênh lệch giữa dầu phi công tự ý lấy thêm và dầu kế hoạch, kèm lý do do phi công nhập; điều phái xem nhanh qua chế độ hover trên ô. Block Fuel hiển thị số kilogram khi cần; mặc định chỉ hiện cảnh báo khi giá trị quá ngưỡng. Khi hover lên ô của các cột nhiên liệu, hiển thị thông tin nhanh; khi click vào ô, mở chi tiết lịch sử cập nhật. Riêng cột Pilot AXA chưa thống nhất rõ phải cảnh báo gì ngoài việc cho điều phái biết phi công đã ghi lý do hay chưa.</w:t>
+        <w:t xml:space="preserve">Luồng dữ liệu tải trọng tự động từ CLC chạy real time qua Lido Import file, đồng thời người dùng có thể nhập tay khi điện tự động không gửi được. Luồng dữ liệu DAO được kỳ vọng lấy từ FOEM khi sẵn sàng, tạm thời dùng file DOW fixed qua Adapter. Một rủi ro lớn được nêu trong buổi chiều là Adapter giữa AVES và Lido bị giới hạn hai mươi ký tự cho trường tên crew, dẫn đến phải cắt tên dài và làm sai lệch thuật toán matching PIC giữa OFP và AVES; phương án hiện nay là cắt mười sáu ký tự cho tên cộng bốn ký tự cho group code. Cơ chế ưu tiên Actual Fuel ưu tiên lấy từ ACARS trước, sau đó mới đến QAR; trường hợp các luồng tích hợp Lido/AMOS bị lỗi thì cho phép điều phái upload tài liệu thủ công làm phương án thay thế.</w:t>
       </w:r>
     </w:p>
     <w:p>
@@ -947,17 +1000,17 @@
         <w:t xml:space="preserve"> </w:t>
       </w:r>
       <w:r>
-        <w:t xml:space="preserve">Ba cột nhiên liệu được hiển thị theo nguyên tắc tối giản: chỉ hiện số khi vượt ngưỡng hoặc khi có chênh lệch; tương tác hover xem nhanh và click xem chi tiết; quy tắc cảnh báo cụ thể của Pilot AXA cần làm rõ thêm.</w:t>
+        <w:t xml:space="preserve">Sơ đồ tích hợp gồm bốn nguồn dữ liệu chính (AMOS, Lido, FOEM, AVES) cộng luồng CLC qua Lido Import file; rủi ro giới hạn hai mươi ký tự của Adapter Lido cần phương án xử lý dứt điểm; cơ chế dự phòng upload thủ công khi tích hợp lỗi đã được ghi nhận.</w:t>
       </w:r>
     </w:p>
     <w:bookmarkEnd w:id="62"/>
-    <w:bookmarkStart w:id="63" w:name="X6a347a20ea226c0bca9b775a817af44dce32f4d"/>
+    <w:bookmarkStart w:id="63" w:name="X9e1bc3d2b9d7cd22c4c8c5e02c2b579ade3a40e"/>
     <w:p>
       <w:pPr>
         <w:pStyle w:val="Heading3"/>
       </w:pPr>
       <w:r>
-        <w:t xml:space="preserve">12. Tích hợp và rủi ro Adapter — AMOS, Lido Import file, ưu tiên Actual Fuel ACARS (buổi sáng + chiều)</w:t>
+        <w:t xml:space="preserve">13. Màn Flight Plan dạng danh sách — duy trì song song với màn Monitoring (buổi chiều)</w:t>
       </w:r>
     </w:p>
     <w:p>
@@ -975,7 +1028,7 @@
         <w:t xml:space="preserve"> </w:t>
       </w:r>
       <w:r>
-        <w:t xml:space="preserve">Phân hệ Điều phái phụ thuộc vào nhiều luồng tích hợp gồm AMOS (cấp MEL, defect, techlog), Lido (kế hoạch bay, gói tài liệu chuyến bay, OFP), FOEM (cấp DOW), AVES (cấp tổ bay), CLC (cấp điện payload, DAO actual).</w:t>
+        <w:t xml:space="preserve">Bộ phận Điều phái mong muốn duy trì một màn hình thứ hai dạng danh sách (giống Netline hiện hữu) bên cạnh màn Monitoring để xem nhiều thông tin về OFP theo dạng bảng, lọc nhanh theo người làm OFP, lọc theo trạng thái, và xem các thông số như Block view, Taxi, CI.</w:t>
       </w:r>
     </w:p>
     <w:p>
@@ -993,7 +1046,7 @@
         <w:t xml:space="preserve"> </w:t>
       </w:r>
       <w:r>
-        <w:t xml:space="preserve">Luồng dữ liệu tải trọng tự động từ CLC chạy real time qua Lido Import file, đồng thời người dùng có thể nhập tay khi điện tự động không gửi được. Luồng dữ liệu DAO được kỳ vọng lấy từ FOEM khi sẵn sàng, tạm thời dùng file DOW fixed qua Adapter. Một rủi ro lớn được nêu trong buổi chiều là Adapter giữa AVES và Lido bị giới hạn hai mươi ký tự cho trường tên crew, dẫn đến phải cắt tên dài và làm sai lệch thuật toán matching PIC giữa OFP và AVES; phương án hiện nay là cắt mười sáu ký tự cho tên cộng bốn ký tự cho group code. Cơ chế ưu tiên Actual Fuel ưu tiên lấy từ ACARS trước, sau đó mới đến QAR; trường hợp các luồng tích hợp Lido/AMOS bị lỗi thì cho phép điều phái upload tài liệu thủ công làm phương án thay thế.</w:t>
+        <w:t xml:space="preserve">Hai bên thống nhất giữ song song hai màn: màn Monitoring là màn vận hành chính với các cột cảnh báo và mốc thời gian, màn Flight Plan dạng danh sách phục vụ tra cứu, thống kê thông tin OFP, có thể thêm các cột thông tin tùy chọn theo nhu cầu người dùng. Màn Monitoring và màn Flight Plan dùng chung dữ liệu nhưng khác về mục đích sử dụng: Monitoring tập trung vào cảnh báo, Flight Plan tập trung vào xem và thống kê.</w:t>
       </w:r>
     </w:p>
     <w:p>
@@ -1011,76 +1064,12 @@
         <w:t xml:space="preserve"> </w:t>
       </w:r>
       <w:r>
-        <w:t xml:space="preserve">Sơ đồ tích hợp gồm bốn nguồn dữ liệu chính (AMOS, Lido, FOEM, AVES) cộng luồng CLC qua Lido Import file; rủi ro giới hạn hai mươi ký tự của Adapter Lido cần phương án xử lý dứt điểm; cơ chế dự phòng upload thủ công khi tích hợp lỗi đã được ghi nhận.</w:t>
+        <w:t xml:space="preserve">Hệ thống cung cấp hai màn song song trong phân hệ Điều phái: Màn Monitoring (giám sát cảnh báo) và Màn Flight Plan dạng danh sách (xem và thống kê OFP), cùng truy cập từ menu điều phái.</w:t>
       </w:r>
     </w:p>
     <w:bookmarkEnd w:id="63"/>
-    <w:bookmarkStart w:id="64" w:name="X9e1bc3d2b9d7cd22c4c8c5e02c2b579ade3a40e"/>
-    <w:p>
-      <w:pPr>
-        <w:pStyle w:val="Heading3"/>
-      </w:pPr>
-      <w:r>
-        <w:t xml:space="preserve">13. Màn Flight Plan dạng danh sách — duy trì song song với màn Monitoring (buổi chiều)</w:t>
-      </w:r>
-    </w:p>
-    <w:p>
-      <w:pPr>
-        <w:pStyle w:val="FirstParagraph"/>
-      </w:pPr>
-      <w:r>
-        <w:rPr>
-          <w:b/>
-          <w:bCs/>
-        </w:rPr>
-        <w:t xml:space="preserve">Yêu cầu.</w:t>
-      </w:r>
-      <w:r>
-        <w:t xml:space="preserve"> </w:t>
-      </w:r>
-      <w:r>
-        <w:t xml:space="preserve">Bộ phận Điều phái mong muốn duy trì một màn hình thứ hai dạng danh sách (giống Netline hiện hữu) bên cạnh màn Monitoring để xem nhiều thông tin về OFP theo dạng bảng, lọc nhanh theo người làm OFP, lọc theo trạng thái, và xem các thông số như Block view, Taxi, CI.</w:t>
-      </w:r>
-    </w:p>
-    <w:p>
-      <w:pPr>
-        <w:pStyle w:val="BodyText"/>
-      </w:pPr>
-      <w:r>
-        <w:rPr>
-          <w:b/>
-          <w:bCs/>
-        </w:rPr>
-        <w:t xml:space="preserve">Thảo luận và Đề xuất.</w:t>
-      </w:r>
-      <w:r>
-        <w:t xml:space="preserve"> </w:t>
-      </w:r>
-      <w:r>
-        <w:t xml:space="preserve">Hai bên thống nhất giữ song song hai màn: màn Monitoring là màn vận hành chính với các cột cảnh báo và mốc thời gian, màn Flight Plan dạng danh sách phục vụ tra cứu, thống kê thông tin OFP, có thể thêm các cột thông tin tùy chọn theo nhu cầu người dùng. Màn Monitoring và màn Flight Plan dùng chung dữ liệu nhưng khác về mục đích sử dụng: Monitoring tập trung vào cảnh báo, Flight Plan tập trung vào xem và thống kê.</w:t>
-      </w:r>
-    </w:p>
-    <w:p>
-      <w:pPr>
-        <w:pStyle w:val="BodyText"/>
-      </w:pPr>
-      <w:r>
-        <w:rPr>
-          <w:b/>
-          <w:bCs/>
-        </w:rPr>
-        <w:t xml:space="preserve">Kết luận.</w:t>
-      </w:r>
-      <w:r>
-        <w:t xml:space="preserve"> </w:t>
-      </w:r>
-      <w:r>
-        <w:t xml:space="preserve">Hệ thống cung cấp hai màn song song trong phân hệ Điều phái: Màn Monitoring (giám sát cảnh báo) và Màn Flight Plan dạng danh sách (xem và thống kê OFP), cùng truy cập từ menu điều phái.</w:t>
-      </w:r>
-    </w:p>
     <w:bookmarkEnd w:id="64"/>
-    <w:bookmarkEnd w:id="65"/>
-    <w:bookmarkStart w:id="66" w:name="iii.-các-nội-dung-đã-thống-nhất"/>
+    <w:bookmarkStart w:id="65" w:name="iii.-các-nội-dung-đã-thống-nhất"/>
     <w:p>
       <w:pPr>
         <w:pStyle w:val="Heading2"/>
@@ -1641,8 +1630,8 @@
         </w:tc>
       </w:tr>
     </w:tbl>
-    <w:bookmarkEnd w:id="66"/>
-    <w:bookmarkStart w:id="67" w:name="iv.-các-nội-dung-cần-làm-rõ"/>
+    <w:bookmarkEnd w:id="65"/>
+    <w:bookmarkStart w:id="66" w:name="iv.-các-nội-dung-cần-làm-rõ"/>
     <w:p>
       <w:pPr>
         <w:pStyle w:val="Heading2"/>
@@ -1865,8 +1854,7 @@
         </w:pict>
       </w:r>
     </w:p>
-    <w:bookmarkEnd w:id="67"/>
-    <w:bookmarkEnd w:id="68"/>
+    <w:bookmarkEnd w:id="66"/>
     <w:sectPr>
       <w:headerReference r:id="rId40" w:type="default"/>
       <w:footerReference r:id="rId41" w:type="default"/>
@@ -2310,8 +2298,8 @@
     </w:pPr>
     <w:rPr>
       <w:rFonts w:ascii="Times New Roman" w:cs="Times New Roman" w:eastAsia="Times New Roman" w:hAnsi="Times New Roman"/>
-      <w:sz w:val="56"/>
-      <w:szCs w:val="56"/>
+      <w:sz w:val="36"/>
+      <w:szCs w:val="36"/>
     </w:rPr>
   </w:style>
   <w:style w:customStyle="1" w:styleId="TitleChar" w:type="character">
@@ -2440,14 +2428,14 @@
       <w:keepNext/>
       <w:keepLines/>
       <w:spacing w:after="240" w:before="360" w:line="240" w:lineRule="auto"/>
-      <w:jc w:val="center"/>
+      <w:jc w:val="left"/>
       <w:outlineLvl w:val="0"/>
     </w:pPr>
     <w:rPr>
       <w:rFonts w:ascii="Times New Roman" w:cs="Times New Roman" w:eastAsia="Times New Roman" w:hAnsi="Times New Roman"/>
       <w:color w:val="000000"/>
-      <w:sz w:val="36"/>
-      <w:szCs w:val="36"/>
+      <w:sz w:val="24"/>
+      <w:szCs w:val="24"/>
     </w:rPr>
   </w:style>
   <w:style w:styleId="Heading2" w:type="paragraph">

</xml_diff>

<commit_message>
feat(export-word): tham số Word Heading3 + áp đúng cấp (I,II=16pt bold; I.1,I.2=13pt bold)
- Thêm -H3Font/-H3Size/-H3Bold/-H3Align cho Word Heading3 (= mục con I.1, I.2)
- Làm rõ ánh xạ cấp: Title(#) / mục lớn I,II = Word Heading2(##) / mục con I.1,I.2 = Word Heading3(###)
- QC bold-order mở rộng cho Heading3
- Xuất lại 2 báo cáo đúng spec: Title 18pt giữa, I/II 16pt bold, I.1/I.2 13pt bold, body 13pt; QC PASS 27/27
- SKILL.md §3: bảng ánh xạ cấp + tham số H3

Co-Authored-By: Claude Opus 4.8 (1M context) <noreply@anthropic.com>
</commit_message>
<xml_diff>
--- a/ba/sync/output/human/exports/BAO-CAO-KHAO-SAT-TOSS-18062026-v0.1-2026-06-22.docx
+++ b/ba/sync/output/human/exports/BAO-CAO-KHAO-SAT-TOSS-18062026-v0.1-2026-06-22.docx
@@ -2460,8 +2460,8 @@
       <w:b/>
       <w:bCs/>
       <w:color w:val="000000"/>
-      <w:sz w:val="26"/>
-      <w:szCs w:val="26"/>
+      <w:sz w:val="32"/>
+      <w:szCs w:val="32"/>
     </w:rPr>
   </w:style>
   <w:style w:styleId="Heading3" w:type="paragraph">
@@ -2483,9 +2483,11 @@
     </w:pPr>
     <w:rPr>
       <w:rFonts w:cstheme="majorBidi" w:eastAsiaTheme="majorEastAsia"/>
+      <w:b/>
+      <w:bCs/>
       <w:color w:val="000000"/>
-      <w:sz w:val="22"/>
-      <w:szCs w:val="22"/>
+      <w:sz w:val="26"/>
+      <w:szCs w:val="26"/>
     </w:rPr>
   </w:style>
   <w:style w:styleId="Heading4" w:type="paragraph">

</xml_diff>